<commit_message>
Fix captain scorecard guide screenshots
</commit_message>
<xml_diff>
--- a/deliverables/Rack-and-Frame-Captain-and-Vice-Captain-Guide-2026-27.docx
+++ b/deliverables/Rack-and-Frame-Captain-and-Vice-Captain-Guide-2026-27.docx
@@ -1091,7 +1091,7 @@
               <a:graphicData uri="http://schemas.openxmlformats.org/drawingml/2006/picture">
                 <pic:pic>
                   <pic:nvPicPr>
-                    <pic:cNvPr id="0" name="rf-training-final-review.png"/>
+                    <pic:cNvPr id="0" name="rf-training-final-review-for-doc.png"/>
                     <pic:cNvPicPr/>
                   </pic:nvPicPr>
                   <pic:blipFill>
@@ -1159,7 +1159,7 @@
               <a:graphicData uri="http://schemas.openxmlformats.org/drawingml/2006/picture">
                 <pic:pic>
                   <pic:nvPicPr>
-                    <pic:cNvPr id="0" name="rf-training-submission-confirmation.png"/>
+                    <pic:cNvPr id="0" name="rf-training-submission-confirmation-for-doc.png"/>
                     <pic:cNvPicPr/>
                   </pic:nvPicPr>
                   <pic:blipFill>

</xml_diff>

<commit_message>
Update captain guides for winter lineup flows
</commit_message>
<xml_diff>
--- a/deliverables/Rack-and-Frame-Captain-and-Vice-Captain-Guide-2026-27.docx
+++ b/deliverables/Rack-and-Frame-Captain-and-Vice-Captain-Guide-2026-27.docx
@@ -4,14 +4,13 @@
   <w:body>
     <w:p>
       <w:pPr>
-        <w:spacing w:after="320"/>
         <w:jc w:val="left"/>
       </w:pPr>
       <w:r>
         <w:drawing>
           <wp:inline xmlns:a="http://schemas.openxmlformats.org/drawingml/2006/main" xmlns:pic="http://schemas.openxmlformats.org/drawingml/2006/picture">
             <wp:extent cx="658368" cy="574499"/>
-            <wp:docPr id="1" name="Picture 1" descr="Rack and Frame logo" title="Rack and Frame logo"/>
+            <wp:docPr id="1" name="Picture 1"/>
             <wp:cNvGraphicFramePr>
               <a:graphicFrameLocks noChangeAspect="1"/>
             </wp:cNvGraphicFramePr>
@@ -51,36 +50,16 @@
       </w:r>
     </w:p>
     <w:p>
-      <w:pPr>
-        <w:spacing w:after="320"/>
-      </w:pPr>
       <w:r>
         <w:rPr>
-          <w:rFonts w:ascii="Aptos" w:hAnsi="Aptos"/>
-          <w:color w:val="5F6B76"/>
-          <w:sz w:val="28"/>
+          <w:color w:val="0F766E"/>
+          <w:sz w:val="30"/>
         </w:rPr>
-        <w:t>The complete match night process for team officials</w:t>
+        <w:t>The complete winter league match night process for team officials</w:t>
       </w:r>
     </w:p>
     <w:p>
       <w:r>
-        <w:rPr>
-          <w:rFonts w:ascii="Aptos" w:hAnsi="Aptos"/>
-          <w:b/>
-          <w:color w:val="147D78"/>
-          <w:sz w:val="22"/>
-        </w:rPr>
-        <w:t>For appointed captains and vice captains</w:t>
-      </w:r>
-    </w:p>
-    <w:p>
-      <w:r>
-        <w:rPr>
-          <w:rFonts w:ascii="Aptos" w:hAnsi="Aptos"/>
-          <w:color w:val="5F6B76"/>
-          <w:sz w:val="20"/>
-        </w:rPr>
         <w:t>Gravesend and District Indoor Games League  |  2026 and 2027 season</w:t>
       </w:r>
     </w:p>
@@ -89,17 +68,12 @@
         <w:pStyle w:val="Heading1"/>
       </w:pPr>
       <w:r>
-        <w:t>Your role in the app</w:t>
+        <w:t>What this guide covers</w:t>
       </w:r>
     </w:p>
     <w:p>
       <w:r>
-        <w:t>Captains and vice-captains manage the official pre-match lineup and match result for their team. Both roles use the same Captain Results workflow once a league officer has assigned the role.</w:t>
-      </w:r>
-    </w:p>
-    <w:p>
-      <w:r>
-        <w:t>The home team enters its lineup first. The away team responds after the home lineup has been submitted. Once both lineups are locked, the scorecard becomes available for match entry.</w:t>
+        <w:t>Captains and vice-captains use the same Captain Results journey. This guide explains the normal four-player winter lineup, the two-player and three-player exceptions, agreed proxy entry, frame scoring, breaks and final submission.</w:t>
       </w:r>
     </w:p>
     <w:p>
@@ -117,42 +91,37 @@
         <w:tblLayout w:type="fixed"/>
         <w:tblLook w:firstColumn="1" w:firstRow="1" w:lastColumn="0" w:lastRow="0" w:noHBand="0" w:noVBand="1" w:val="04A0"/>
         <w:tblBorders>
-          <w:top w:val="single" w:sz="4" w:color="D9D9D9"/>
-          <w:left w:val="single" w:sz="4" w:color="D9D9D9"/>
-          <w:bottom w:val="single" w:sz="4" w:color="D9D9D9"/>
-          <w:right w:val="single" w:sz="4" w:color="D9D9D9"/>
-          <w:insideH w:val="single" w:sz="4" w:color="D9D9D9"/>
-          <w:insideV w:val="single" w:sz="4" w:color="D9D9D9"/>
+          <w:top w:val="single" w:sz="6" w:color="D9D9D9"/>
+          <w:left w:val="single" w:sz="6" w:color="D9D9D9"/>
+          <w:bottom w:val="single" w:sz="6" w:color="D9D9D9"/>
+          <w:right w:val="single" w:sz="6" w:color="D9D9D9"/>
+          <w:insideH w:val="single" w:sz="6" w:color="D9D9D9"/>
+          <w:insideV w:val="single" w:sz="6" w:color="D9D9D9"/>
         </w:tblBorders>
       </w:tblPr>
       <w:tblGrid>
-        <w:gridCol w:w="3312"/>
-        <w:gridCol w:w="3312"/>
-        <w:gridCol w:w="3312"/>
+        <w:gridCol w:w="3289"/>
+        <w:gridCol w:w="3289"/>
+        <w:gridCol w:w="3289"/>
       </w:tblGrid>
       <w:tr>
-        <w:trPr>
-          <w:tblHeader w:val="true"/>
-        </w:trPr>
         <w:tc>
           <w:tcPr>
-            <w:tcW w:type="dxa" w:w="792"/>
-            <w:shd w:fill="17324D"/>
+            <w:tcW w:type="dxa" w:w="794"/>
+            <w:shd w:fill="0F2744"/>
             <w:vAlign w:val="center"/>
-            <w:tcMar>
-              <w:top w:w="110" w:type="dxa"/>
-              <w:start w:w="140" w:type="dxa"/>
-              <w:bottom w:w="110" w:type="dxa"/>
-              <w:end w:w="140" w:type="dxa"/>
-            </w:tcMar>
           </w:tcPr>
           <w:p>
+            <w:pPr>
+              <w:spacing w:after="0"/>
+            </w:pPr>
+            <w:r/>
             <w:r>
               <w:rPr>
-                <w:rFonts w:ascii="Aptos" w:hAnsi="Aptos"/>
+                <w:rFonts w:ascii="Arial" w:hAnsi="Arial"/>
                 <w:b/>
                 <w:color w:val="FFFFFF"/>
-                <w:sz w:val="21"/>
+                <w:sz w:val="19"/>
               </w:rPr>
               <w:t>Step</w:t>
             </w:r>
@@ -160,23 +129,21 @@
         </w:tc>
         <w:tc>
           <w:tcPr>
-            <w:tcW w:type="dxa" w:w="2376"/>
-            <w:shd w:fill="17324D"/>
+            <w:tcW w:type="dxa" w:w="2381"/>
+            <w:shd w:fill="0F2744"/>
             <w:vAlign w:val="center"/>
-            <w:tcMar>
-              <w:top w:w="110" w:type="dxa"/>
-              <w:start w:w="140" w:type="dxa"/>
-              <w:bottom w:w="110" w:type="dxa"/>
-              <w:end w:w="140" w:type="dxa"/>
-            </w:tcMar>
           </w:tcPr>
           <w:p>
+            <w:pPr>
+              <w:spacing w:after="0"/>
+            </w:pPr>
+            <w:r/>
             <w:r>
               <w:rPr>
-                <w:rFonts w:ascii="Aptos" w:hAnsi="Aptos"/>
+                <w:rFonts w:ascii="Arial" w:hAnsi="Arial"/>
                 <w:b/>
                 <w:color w:val="FFFFFF"/>
-                <w:sz w:val="21"/>
+                <w:sz w:val="19"/>
               </w:rPr>
               <w:t>Action</w:t>
             </w:r>
@@ -184,23 +151,21 @@
         </w:tc>
         <w:tc>
           <w:tcPr>
-            <w:tcW w:type="dxa" w:w="6696"/>
-            <w:shd w:fill="17324D"/>
+            <w:tcW w:type="dxa" w:w="6236"/>
+            <w:shd w:fill="0F2744"/>
             <w:vAlign w:val="center"/>
-            <w:tcMar>
-              <w:top w:w="110" w:type="dxa"/>
-              <w:start w:w="140" w:type="dxa"/>
-              <w:bottom w:w="110" w:type="dxa"/>
-              <w:end w:w="140" w:type="dxa"/>
-            </w:tcMar>
           </w:tcPr>
           <w:p>
+            <w:pPr>
+              <w:spacing w:after="0"/>
+            </w:pPr>
+            <w:r/>
             <w:r>
               <w:rPr>
-                <w:rFonts w:ascii="Aptos" w:hAnsi="Aptos"/>
+                <w:rFonts w:ascii="Arial" w:hAnsi="Arial"/>
                 <w:b/>
                 <w:color w:val="FFFFFF"/>
-                <w:sz w:val="21"/>
+                <w:sz w:val="19"/>
               </w:rPr>
               <w:t>What to do</w:t>
             </w:r>
@@ -210,24 +175,21 @@
       <w:tr>
         <w:tc>
           <w:tcPr>
-            <w:tcW w:type="dxa" w:w="792"/>
+            <w:tcW w:type="dxa" w:w="794"/>
+            <w:shd w:fill="FFFFFF"/>
             <w:vAlign w:val="center"/>
-            <w:tcMar>
-              <w:top w:w="110" w:type="dxa"/>
-              <w:start w:w="140" w:type="dxa"/>
-              <w:bottom w:w="110" w:type="dxa"/>
-              <w:end w:w="140" w:type="dxa"/>
-            </w:tcMar>
           </w:tcPr>
           <w:p>
             <w:pPr>
-              <w:jc w:val="center"/>
+              <w:spacing w:after="0"/>
             </w:pPr>
+            <w:r/>
             <w:r>
               <w:rPr>
-                <w:rFonts w:ascii="Aptos" w:hAnsi="Aptos"/>
+                <w:rFonts w:ascii="Arial" w:hAnsi="Arial"/>
                 <w:b w:val="0"/>
-                <w:sz w:val="21"/>
+                <w:color w:val="000000"/>
+                <w:sz w:val="19"/>
               </w:rPr>
               <w:t>1</w:t>
             </w:r>
@@ -235,21 +197,21 @@
         </w:tc>
         <w:tc>
           <w:tcPr>
-            <w:tcW w:type="dxa" w:w="2376"/>
+            <w:tcW w:type="dxa" w:w="2381"/>
+            <w:shd w:fill="FFFFFF"/>
             <w:vAlign w:val="center"/>
-            <w:tcMar>
-              <w:top w:w="110" w:type="dxa"/>
-              <w:start w:w="140" w:type="dxa"/>
-              <w:bottom w:w="110" w:type="dxa"/>
-              <w:end w:w="140" w:type="dxa"/>
-            </w:tcMar>
           </w:tcPr>
           <w:p>
+            <w:pPr>
+              <w:spacing w:after="0"/>
+            </w:pPr>
+            <w:r/>
             <w:r>
               <w:rPr>
-                <w:rFonts w:ascii="Aptos" w:hAnsi="Aptos"/>
+                <w:rFonts w:ascii="Arial" w:hAnsi="Arial"/>
                 <w:b/>
-                <w:sz w:val="21"/>
+                <w:color w:val="000000"/>
+                <w:sz w:val="19"/>
               </w:rPr>
               <w:t>Open the fixture</w:t>
             </w:r>
@@ -257,23 +219,23 @@
         </w:tc>
         <w:tc>
           <w:tcPr>
-            <w:tcW w:type="dxa" w:w="6696"/>
+            <w:tcW w:type="dxa" w:w="6236"/>
+            <w:shd w:fill="FFFFFF"/>
             <w:vAlign w:val="center"/>
-            <w:tcMar>
-              <w:top w:w="110" w:type="dxa"/>
-              <w:start w:w="140" w:type="dxa"/>
-              <w:bottom w:w="110" w:type="dxa"/>
-              <w:end w:w="140" w:type="dxa"/>
-            </w:tcMar>
           </w:tcPr>
           <w:p>
+            <w:pPr>
+              <w:spacing w:after="0"/>
+            </w:pPr>
+            <w:r/>
             <w:r>
               <w:rPr>
-                <w:rFonts w:ascii="Aptos" w:hAnsi="Aptos"/>
+                <w:rFonts w:ascii="Arial" w:hAnsi="Arial"/>
                 <w:b w:val="0"/>
-                <w:sz w:val="21"/>
+                <w:color w:val="000000"/>
+                <w:sz w:val="19"/>
               </w:rPr>
-              <w:t>Open Captain Results and select tonight's match.</w:t>
+              <w:t>Open Captain Results and confirm the fixture, teams and date.</w:t>
             </w:r>
           </w:p>
         </w:tc>
@@ -281,25 +243,21 @@
       <w:tr>
         <w:tc>
           <w:tcPr>
-            <w:tcW w:type="dxa" w:w="792"/>
-            <w:shd w:fill="EDF3F8"/>
+            <w:tcW w:type="dxa" w:w="794"/>
+            <w:shd w:fill="EAF4FA"/>
             <w:vAlign w:val="center"/>
-            <w:tcMar>
-              <w:top w:w="110" w:type="dxa"/>
-              <w:start w:w="140" w:type="dxa"/>
-              <w:bottom w:w="110" w:type="dxa"/>
-              <w:end w:w="140" w:type="dxa"/>
-            </w:tcMar>
           </w:tcPr>
           <w:p>
             <w:pPr>
-              <w:jc w:val="center"/>
+              <w:spacing w:after="0"/>
             </w:pPr>
+            <w:r/>
             <w:r>
               <w:rPr>
-                <w:rFonts w:ascii="Aptos" w:hAnsi="Aptos"/>
+                <w:rFonts w:ascii="Arial" w:hAnsi="Arial"/>
                 <w:b w:val="0"/>
-                <w:sz w:val="21"/>
+                <w:color w:val="000000"/>
+                <w:sz w:val="19"/>
               </w:rPr>
               <w:t>2</w:t>
             </w:r>
@@ -307,22 +265,157 @@
         </w:tc>
         <w:tc>
           <w:tcPr>
-            <w:tcW w:type="dxa" w:w="2376"/>
-            <w:shd w:fill="EDF3F8"/>
+            <w:tcW w:type="dxa" w:w="2381"/>
+            <w:shd w:fill="EAF4FA"/>
             <w:vAlign w:val="center"/>
-            <w:tcMar>
-              <w:top w:w="110" w:type="dxa"/>
-              <w:start w:w="140" w:type="dxa"/>
-              <w:bottom w:w="110" w:type="dxa"/>
-              <w:end w:w="140" w:type="dxa"/>
-            </w:tcMar>
           </w:tcPr>
           <w:p>
+            <w:pPr>
+              <w:spacing w:after="0"/>
+            </w:pPr>
+            <w:r/>
             <w:r>
               <w:rPr>
-                <w:rFonts w:ascii="Aptos" w:hAnsi="Aptos"/>
+                <w:rFonts w:ascii="Arial" w:hAnsi="Arial"/>
                 <w:b/>
-                <w:sz w:val="21"/>
+                <w:color w:val="000000"/>
+                <w:sz w:val="19"/>
+              </w:rPr>
+              <w:t>Choose entry method</w:t>
+            </w:r>
+          </w:p>
+        </w:tc>
+        <w:tc>
+          <w:tcPr>
+            <w:tcW w:type="dxa" w:w="6236"/>
+            <w:shd w:fill="EAF4FA"/>
+            <w:vAlign w:val="center"/>
+          </w:tcPr>
+          <w:p>
+            <w:pPr>
+              <w:spacing w:after="0"/>
+            </w:pPr>
+            <w:r/>
+            <w:r>
+              <w:rPr>
+                <w:rFonts w:ascii="Arial" w:hAnsi="Arial"/>
+                <w:b w:val="0"/>
+                <w:color w:val="000000"/>
+                <w:sz w:val="19"/>
+              </w:rPr>
+              <w:t>Use the normal home-first process, or enable agreed proxy entry before selecting players.</w:t>
+            </w:r>
+          </w:p>
+        </w:tc>
+      </w:tr>
+      <w:tr>
+        <w:tc>
+          <w:tcPr>
+            <w:tcW w:type="dxa" w:w="794"/>
+            <w:shd w:fill="FFFFFF"/>
+            <w:vAlign w:val="center"/>
+          </w:tcPr>
+          <w:p>
+            <w:pPr>
+              <w:spacing w:after="0"/>
+            </w:pPr>
+            <w:r/>
+            <w:r>
+              <w:rPr>
+                <w:rFonts w:ascii="Arial" w:hAnsi="Arial"/>
+                <w:b w:val="0"/>
+                <w:color w:val="000000"/>
+                <w:sz w:val="19"/>
+              </w:rPr>
+              <w:t>3</w:t>
+            </w:r>
+          </w:p>
+        </w:tc>
+        <w:tc>
+          <w:tcPr>
+            <w:tcW w:type="dxa" w:w="2381"/>
+            <w:shd w:fill="FFFFFF"/>
+            <w:vAlign w:val="center"/>
+          </w:tcPr>
+          <w:p>
+            <w:pPr>
+              <w:spacing w:after="0"/>
+            </w:pPr>
+            <w:r/>
+            <w:r>
+              <w:rPr>
+                <w:rFonts w:ascii="Arial" w:hAnsi="Arial"/>
+                <w:b/>
+                <w:color w:val="000000"/>
+                <w:sz w:val="19"/>
+              </w:rPr>
+              <w:t>Complete five frames</w:t>
+            </w:r>
+          </w:p>
+        </w:tc>
+        <w:tc>
+          <w:tcPr>
+            <w:tcW w:type="dxa" w:w="6236"/>
+            <w:shd w:fill="FFFFFF"/>
+            <w:vAlign w:val="center"/>
+          </w:tcPr>
+          <w:p>
+            <w:pPr>
+              <w:spacing w:after="0"/>
+            </w:pPr>
+            <w:r/>
+            <w:r>
+              <w:rPr>
+                <w:rFonts w:ascii="Arial" w:hAnsi="Arial"/>
+                <w:b w:val="0"/>
+                <w:color w:val="000000"/>
+                <w:sz w:val="19"/>
+              </w:rPr>
+              <w:t>Enter four singles and one doubles lineup using the appropriate player-availability rule.</w:t>
+            </w:r>
+          </w:p>
+        </w:tc>
+      </w:tr>
+      <w:tr>
+        <w:tc>
+          <w:tcPr>
+            <w:tcW w:type="dxa" w:w="794"/>
+            <w:shd w:fill="EAF4FA"/>
+            <w:vAlign w:val="center"/>
+          </w:tcPr>
+          <w:p>
+            <w:pPr>
+              <w:spacing w:after="0"/>
+            </w:pPr>
+            <w:r/>
+            <w:r>
+              <w:rPr>
+                <w:rFonts w:ascii="Arial" w:hAnsi="Arial"/>
+                <w:b w:val="0"/>
+                <w:color w:val="000000"/>
+                <w:sz w:val="19"/>
+              </w:rPr>
+              <w:t>4</w:t>
+            </w:r>
+          </w:p>
+        </w:tc>
+        <w:tc>
+          <w:tcPr>
+            <w:tcW w:type="dxa" w:w="2381"/>
+            <w:shd w:fill="EAF4FA"/>
+            <w:vAlign w:val="center"/>
+          </w:tcPr>
+          <w:p>
+            <w:pPr>
+              <w:spacing w:after="0"/>
+            </w:pPr>
+            <w:r/>
+            <w:r>
+              <w:rPr>
+                <w:rFonts w:ascii="Arial" w:hAnsi="Arial"/>
+                <w:b/>
+                <w:color w:val="000000"/>
+                <w:sz w:val="19"/>
               </w:rPr>
               <w:t>Submit lineups</w:t>
             </w:r>
@@ -330,24 +423,23 @@
         </w:tc>
         <w:tc>
           <w:tcPr>
-            <w:tcW w:type="dxa" w:w="6696"/>
-            <w:shd w:fill="EDF3F8"/>
+            <w:tcW w:type="dxa" w:w="6236"/>
+            <w:shd w:fill="EAF4FA"/>
             <w:vAlign w:val="center"/>
-            <w:tcMar>
-              <w:top w:w="110" w:type="dxa"/>
-              <w:start w:w="140" w:type="dxa"/>
-              <w:bottom w:w="110" w:type="dxa"/>
-              <w:end w:w="140" w:type="dxa"/>
-            </w:tcMar>
           </w:tcPr>
           <w:p>
+            <w:pPr>
+              <w:spacing w:after="0"/>
+            </w:pPr>
+            <w:r/>
             <w:r>
               <w:rPr>
-                <w:rFonts w:ascii="Aptos" w:hAnsi="Aptos"/>
+                <w:rFonts w:ascii="Arial" w:hAnsi="Arial"/>
                 <w:b w:val="0"/>
-                <w:sz w:val="21"/>
+                <w:color w:val="000000"/>
+                <w:sz w:val="19"/>
               </w:rPr>
-              <w:t>Home submits first; away responds. Complete digital lineups before 19:30.</w:t>
+              <w:t>Home submits first; away confirms unless agreed proxy entry is active.</w:t>
             </w:r>
           </w:p>
         </w:tc>
@@ -355,70 +447,67 @@
       <w:tr>
         <w:tc>
           <w:tcPr>
-            <w:tcW w:type="dxa" w:w="792"/>
+            <w:tcW w:type="dxa" w:w="794"/>
+            <w:shd w:fill="FFFFFF"/>
             <w:vAlign w:val="center"/>
-            <w:tcMar>
-              <w:top w:w="110" w:type="dxa"/>
-              <w:start w:w="140" w:type="dxa"/>
-              <w:bottom w:w="110" w:type="dxa"/>
-              <w:end w:w="140" w:type="dxa"/>
-            </w:tcMar>
           </w:tcPr>
           <w:p>
             <w:pPr>
-              <w:jc w:val="center"/>
+              <w:spacing w:after="0"/>
             </w:pPr>
+            <w:r/>
             <w:r>
               <w:rPr>
-                <w:rFonts w:ascii="Aptos" w:hAnsi="Aptos"/>
+                <w:rFonts w:ascii="Arial" w:hAnsi="Arial"/>
                 <w:b w:val="0"/>
-                <w:sz w:val="21"/>
+                <w:color w:val="000000"/>
+                <w:sz w:val="19"/>
               </w:rPr>
-              <w:t>3</w:t>
+              <w:t>5</w:t>
             </w:r>
           </w:p>
         </w:tc>
         <w:tc>
           <w:tcPr>
-            <w:tcW w:type="dxa" w:w="2376"/>
+            <w:tcW w:type="dxa" w:w="2381"/>
+            <w:shd w:fill="FFFFFF"/>
             <w:vAlign w:val="center"/>
-            <w:tcMar>
-              <w:top w:w="110" w:type="dxa"/>
-              <w:start w:w="140" w:type="dxa"/>
-              <w:bottom w:w="110" w:type="dxa"/>
-              <w:end w:w="140" w:type="dxa"/>
-            </w:tcMar>
           </w:tcPr>
           <w:p>
+            <w:pPr>
+              <w:spacing w:after="0"/>
+            </w:pPr>
+            <w:r/>
             <w:r>
               <w:rPr>
-                <w:rFonts w:ascii="Aptos" w:hAnsi="Aptos"/>
+                <w:rFonts w:ascii="Arial" w:hAnsi="Arial"/>
                 <w:b/>
-                <w:sz w:val="21"/>
+                <w:color w:val="000000"/>
+                <w:sz w:val="19"/>
               </w:rPr>
-              <w:t>Open Scorecard</w:t>
+              <w:t>Record the match</w:t>
             </w:r>
           </w:p>
         </w:tc>
         <w:tc>
           <w:tcPr>
-            <w:tcW w:type="dxa" w:w="6696"/>
+            <w:tcW w:type="dxa" w:w="6236"/>
+            <w:shd w:fill="FFFFFF"/>
             <w:vAlign w:val="center"/>
-            <w:tcMar>
-              <w:top w:w="110" w:type="dxa"/>
-              <w:start w:w="140" w:type="dxa"/>
-              <w:bottom w:w="110" w:type="dxa"/>
-              <w:end w:w="140" w:type="dxa"/>
-            </w:tcMar>
           </w:tcPr>
           <w:p>
+            <w:pPr>
+              <w:spacing w:after="0"/>
+            </w:pPr>
+            <w:r/>
             <w:r>
               <w:rPr>
-                <w:rFonts w:ascii="Aptos" w:hAnsi="Aptos"/>
+                <w:rFonts w:ascii="Arial" w:hAnsi="Arial"/>
                 <w:b w:val="0"/>
-                <w:sz w:val="21"/>
+                <w:color w:val="000000"/>
+                <w:sz w:val="19"/>
               </w:rPr>
-              <w:t>Check both lineups, then switch from Lineup to Scorecard.</w:t>
+              <w:t>Enter every frame score and all breaks of 30 or more.</w:t>
             </w:r>
           </w:p>
         </w:tc>
@@ -426,170 +515,21 @@
       <w:tr>
         <w:tc>
           <w:tcPr>
-            <w:tcW w:type="dxa" w:w="792"/>
-            <w:shd w:fill="EDF3F8"/>
+            <w:tcW w:type="dxa" w:w="794"/>
+            <w:shd w:fill="EAF4FA"/>
             <w:vAlign w:val="center"/>
-            <w:tcMar>
-              <w:top w:w="110" w:type="dxa"/>
-              <w:start w:w="140" w:type="dxa"/>
-              <w:bottom w:w="110" w:type="dxa"/>
-              <w:end w:w="140" w:type="dxa"/>
-            </w:tcMar>
           </w:tcPr>
           <w:p>
             <w:pPr>
-              <w:jc w:val="center"/>
+              <w:spacing w:after="0"/>
             </w:pPr>
+            <w:r/>
             <w:r>
               <w:rPr>
-                <w:rFonts w:ascii="Aptos" w:hAnsi="Aptos"/>
+                <w:rFonts w:ascii="Arial" w:hAnsi="Arial"/>
                 <w:b w:val="0"/>
-                <w:sz w:val="21"/>
-              </w:rPr>
-              <w:t>4</w:t>
-            </w:r>
-          </w:p>
-        </w:tc>
-        <w:tc>
-          <w:tcPr>
-            <w:tcW w:type="dxa" w:w="2376"/>
-            <w:shd w:fill="EDF3F8"/>
-            <w:vAlign w:val="center"/>
-            <w:tcMar>
-              <w:top w:w="110" w:type="dxa"/>
-              <w:start w:w="140" w:type="dxa"/>
-              <w:bottom w:w="110" w:type="dxa"/>
-              <w:end w:w="140" w:type="dxa"/>
-            </w:tcMar>
-          </w:tcPr>
-          <w:p>
-            <w:r>
-              <w:rPr>
-                <w:rFonts w:ascii="Aptos" w:hAnsi="Aptos"/>
-                <w:b/>
-                <w:sz w:val="21"/>
-              </w:rPr>
-              <w:t>Record every frame</w:t>
-            </w:r>
-          </w:p>
-        </w:tc>
-        <w:tc>
-          <w:tcPr>
-            <w:tcW w:type="dxa" w:w="6696"/>
-            <w:shd w:fill="EDF3F8"/>
-            <w:vAlign w:val="center"/>
-            <w:tcMar>
-              <w:top w:w="110" w:type="dxa"/>
-              <w:start w:w="140" w:type="dxa"/>
-              <w:bottom w:w="110" w:type="dxa"/>
-              <w:end w:w="140" w:type="dxa"/>
-            </w:tcMar>
-          </w:tcPr>
-          <w:p>
-            <w:r>
-              <w:rPr>
-                <w:rFonts w:ascii="Aptos" w:hAnsi="Aptos"/>
-                <w:b w:val="0"/>
-                <w:sz w:val="21"/>
-              </w:rPr>
-              <w:t>Enter players, points and any break of 30 or more.</w:t>
-            </w:r>
-          </w:p>
-        </w:tc>
-      </w:tr>
-      <w:tr>
-        <w:tc>
-          <w:tcPr>
-            <w:tcW w:type="dxa" w:w="792"/>
-            <w:vAlign w:val="center"/>
-            <w:tcMar>
-              <w:top w:w="110" w:type="dxa"/>
-              <w:start w:w="140" w:type="dxa"/>
-              <w:bottom w:w="110" w:type="dxa"/>
-              <w:end w:w="140" w:type="dxa"/>
-            </w:tcMar>
-          </w:tcPr>
-          <w:p>
-            <w:pPr>
-              <w:jc w:val="center"/>
-            </w:pPr>
-            <w:r>
-              <w:rPr>
-                <w:rFonts w:ascii="Aptos" w:hAnsi="Aptos"/>
-                <w:b w:val="0"/>
-                <w:sz w:val="21"/>
-              </w:rPr>
-              <w:t>5</w:t>
-            </w:r>
-          </w:p>
-        </w:tc>
-        <w:tc>
-          <w:tcPr>
-            <w:tcW w:type="dxa" w:w="2376"/>
-            <w:vAlign w:val="center"/>
-            <w:tcMar>
-              <w:top w:w="110" w:type="dxa"/>
-              <w:start w:w="140" w:type="dxa"/>
-              <w:bottom w:w="110" w:type="dxa"/>
-              <w:end w:w="140" w:type="dxa"/>
-            </w:tcMar>
-          </w:tcPr>
-          <w:p>
-            <w:r>
-              <w:rPr>
-                <w:rFonts w:ascii="Aptos" w:hAnsi="Aptos"/>
-                <w:b/>
-                <w:sz w:val="21"/>
-              </w:rPr>
-              <w:t>Review the card</w:t>
-            </w:r>
-          </w:p>
-        </w:tc>
-        <w:tc>
-          <w:tcPr>
-            <w:tcW w:type="dxa" w:w="6696"/>
-            <w:vAlign w:val="center"/>
-            <w:tcMar>
-              <w:top w:w="110" w:type="dxa"/>
-              <w:start w:w="140" w:type="dxa"/>
-              <w:bottom w:w="110" w:type="dxa"/>
-              <w:end w:w="140" w:type="dxa"/>
-            </w:tcMar>
-          </w:tcPr>
-          <w:p>
-            <w:r>
-              <w:rPr>
-                <w:rFonts w:ascii="Aptos" w:hAnsi="Aptos"/>
-                <w:b w:val="0"/>
-                <w:sz w:val="21"/>
-              </w:rPr>
-              <w:t>Check every player, score and break with both teams.</w:t>
-            </w:r>
-          </w:p>
-        </w:tc>
-      </w:tr>
-      <w:tr>
-        <w:tc>
-          <w:tcPr>
-            <w:tcW w:type="dxa" w:w="792"/>
-            <w:shd w:fill="EDF3F8"/>
-            <w:vAlign w:val="center"/>
-            <w:tcMar>
-              <w:top w:w="110" w:type="dxa"/>
-              <w:start w:w="140" w:type="dxa"/>
-              <w:bottom w:w="110" w:type="dxa"/>
-              <w:end w:w="140" w:type="dxa"/>
-            </w:tcMar>
-          </w:tcPr>
-          <w:p>
-            <w:pPr>
-              <w:jc w:val="center"/>
-            </w:pPr>
-            <w:r>
-              <w:rPr>
-                <w:rFonts w:ascii="Aptos" w:hAnsi="Aptos"/>
-                <w:b w:val="0"/>
-                <w:sz w:val="21"/>
+                <w:color w:val="000000"/>
+                <w:sz w:val="19"/>
               </w:rPr>
               <w:t>6</w:t>
             </w:r>
@@ -597,52 +537,88 @@
         </w:tc>
         <w:tc>
           <w:tcPr>
-            <w:tcW w:type="dxa" w:w="2376"/>
-            <w:shd w:fill="EDF3F8"/>
+            <w:tcW w:type="dxa" w:w="2381"/>
+            <w:shd w:fill="EAF4FA"/>
             <w:vAlign w:val="center"/>
-            <w:tcMar>
-              <w:top w:w="110" w:type="dxa"/>
-              <w:start w:w="140" w:type="dxa"/>
-              <w:bottom w:w="110" w:type="dxa"/>
-              <w:end w:w="140" w:type="dxa"/>
-            </w:tcMar>
           </w:tcPr>
           <w:p>
+            <w:pPr>
+              <w:spacing w:after="0"/>
+            </w:pPr>
+            <w:r/>
             <w:r>
               <w:rPr>
-                <w:rFonts w:ascii="Aptos" w:hAnsi="Aptos"/>
+                <w:rFonts w:ascii="Arial" w:hAnsi="Arial"/>
                 <w:b/>
-                <w:sz w:val="21"/>
+                <w:color w:val="000000"/>
+                <w:sz w:val="19"/>
               </w:rPr>
-              <w:t>Submit the result</w:t>
+              <w:t>Review and submit</w:t>
             </w:r>
           </w:p>
         </w:tc>
         <w:tc>
           <w:tcPr>
-            <w:tcW w:type="dxa" w:w="6696"/>
-            <w:shd w:fill="EDF3F8"/>
+            <w:tcW w:type="dxa" w:w="6236"/>
+            <w:shd w:fill="EAF4FA"/>
             <w:vAlign w:val="center"/>
-            <w:tcMar>
-              <w:top w:w="110" w:type="dxa"/>
-              <w:start w:w="140" w:type="dxa"/>
-              <w:bottom w:w="110" w:type="dxa"/>
-              <w:end w:w="140" w:type="dxa"/>
-            </w:tcMar>
           </w:tcPr>
           <w:p>
+            <w:pPr>
+              <w:spacing w:after="0"/>
+            </w:pPr>
+            <w:r/>
             <w:r>
               <w:rPr>
-                <w:rFonts w:ascii="Aptos" w:hAnsi="Aptos"/>
+                <w:rFonts w:ascii="Arial" w:hAnsi="Arial"/>
                 <w:b w:val="0"/>
-                <w:sz w:val="21"/>
+                <w:color w:val="000000"/>
+                <w:sz w:val="19"/>
               </w:rPr>
-              <w:t>The home team normally submits by midnight on the following day.</w:t>
+              <w:t>The home team normally submits the agreed result for league-officer approval.</w:t>
             </w:r>
           </w:p>
         </w:tc>
       </w:tr>
     </w:tbl>
+    <w:p>
+      <w:pPr>
+        <w:pStyle w:val="Heading1"/>
+      </w:pPr>
+      <w:r>
+        <w:t>Before selecting players</w:t>
+      </w:r>
+    </w:p>
+    <w:p>
+      <w:pPr>
+        <w:pStyle w:val="ListBullet"/>
+        <w:keepNext w:val="0"/>
+        <w:keepLines/>
+      </w:pPr>
+      <w:r>
+        <w:t>The digital lineup opens on the day of the fixture. Home normally submits first and away then confirms.</w:t>
+      </w:r>
+    </w:p>
+    <w:p>
+      <w:pPr>
+        <w:pStyle w:val="ListBullet"/>
+        <w:keepNext w:val="0"/>
+        <w:keepLines/>
+      </w:pPr>
+      <w:r>
+        <w:t>If both teams agree that one official will operate the app, enable agreed proxy entry before selecting any players.</w:t>
+      </w:r>
+    </w:p>
+    <w:p>
+      <w:pPr>
+        <w:pStyle w:val="ListBullet"/>
+        <w:keepNext w:val="0"/>
+        <w:keepLines/>
+      </w:pPr>
+      <w:r>
+        <w:t>There is no paper-record option inside this digital journey. If the app cannot be used, keep an accurate manual scorecard and contact the League Secretary for the separate result-upload link.</w:t>
+      </w:r>
+    </w:p>
     <w:p>
       <w:r>
         <w:br w:type="page"/>
@@ -651,26 +627,34 @@
     <w:p>
       <w:pPr>
         <w:pStyle w:val="Heading1"/>
+        <w:keepNext/>
+        <w:keepLines/>
       </w:pPr>
       <w:r>
-        <w:t>The captain screen step by step</w:t>
-      </w:r>
-    </w:p>
-    <w:p>
-      <w:r>
-        <w:t>These screenshots show the live mobile view. The fixture and team names will change, but the controls and sequence remain the same.</w:t>
+        <w:t>Normal four player winter lineup</w:t>
       </w:r>
     </w:p>
     <w:p>
       <w:pPr>
-        <w:spacing w:before="80" w:after="60"/>
+        <w:keepNext/>
+        <w:keepLines/>
+      </w:pPr>
+      <w:r>
+        <w:t>Select four different singles players. Then choose two eligible players for Frame 5 doubles. The action buttons are deliberately placed after the final frame.</w:t>
+      </w:r>
+    </w:p>
+    <w:p>
+      <w:pPr>
+        <w:keepNext w:val="0"/>
+        <w:keepLines/>
+        <w:spacing w:before="60"/>
         <w:jc w:val="center"/>
       </w:pPr>
       <w:r>
         <w:drawing>
           <wp:inline xmlns:a="http://schemas.openxmlformats.org/drawingml/2006/main" xmlns:pic="http://schemas.openxmlformats.org/drawingml/2006/picture">
-            <wp:extent cx="5303520" cy="6309020"/>
-            <wp:docPr id="2" name="Picture 2" descr="Captain Results fixture selector with Team lineup active and Scorecard locked" title="Captain Results fixture selector with Team lineup active and Scorecard locked"/>
+            <wp:extent cx="5486400" cy="6000896"/>
+            <wp:docPr id="2" name="Picture 2"/>
             <wp:cNvGraphicFramePr>
               <a:graphicFrameLocks noChangeAspect="1"/>
             </wp:cNvGraphicFramePr>
@@ -678,7 +662,7 @@
               <a:graphicData uri="http://schemas.openxmlformats.org/drawingml/2006/picture">
                 <pic:pic>
                   <pic:nvPicPr>
-                    <pic:cNvPr id="0" name="rf-captain-step-1.png"/>
+                    <pic:cNvPr id="0" name="captain-winter-four-player.png"/>
                     <pic:cNvPicPr/>
                   </pic:nvPicPr>
                   <pic:blipFill>
@@ -690,7 +674,7 @@
                   <pic:spPr>
                     <a:xfrm>
                       <a:off x="0" y="0"/>
-                      <a:ext cx="5303520" cy="6309020"/>
+                      <a:ext cx="5486400" cy="6000896"/>
                     </a:xfrm>
                     <a:prstGeom prst="rect"/>
                   </pic:spPr>
@@ -703,17 +687,244 @@
     </w:p>
     <w:p>
       <w:pPr>
-        <w:spacing w:after="140"/>
+        <w:pStyle w:val="Caption"/>
+        <w:keepNext w:val="0"/>
+        <w:keepLines/>
         <w:jc w:val="center"/>
       </w:pPr>
       <w:r>
-        <w:rPr>
-          <w:rFonts w:ascii="Aptos" w:hAnsi="Aptos"/>
-          <w:i/>
-          <w:color w:val="5F6B76"/>
-          <w:sz w:val="19"/>
-        </w:rPr>
-        <w:t>Choose the fixture. Team lineup is Step 1; Scorecard unlocks only after the lineup process is complete.</w:t>
+        <w:t>Normal winter lineup with four singles, one doubles frame and the lineup actions at the end of the journey.</w:t>
+      </w:r>
+    </w:p>
+    <w:p>
+      <w:r>
+        <w:br w:type="page"/>
+      </w:r>
+    </w:p>
+    <w:p>
+      <w:pPr>
+        <w:pStyle w:val="Heading1"/>
+        <w:keepNext/>
+        <w:keepLines/>
+      </w:pPr>
+      <w:r>
+        <w:t>Agreed proxy entry</w:t>
+      </w:r>
+    </w:p>
+    <w:p>
+      <w:pPr>
+        <w:keepNext/>
+        <w:keepLines/>
+      </w:pPr>
+      <w:r>
+        <w:t>Use this only when both teams agree. Enable it at the top of the page before entering lineups; it unlocks both teams' fields so one captain or vice-captain can complete both sides.</w:t>
+      </w:r>
+    </w:p>
+    <w:p>
+      <w:pPr>
+        <w:keepNext w:val="0"/>
+        <w:keepLines/>
+        <w:spacing w:before="60"/>
+        <w:jc w:val="center"/>
+      </w:pPr>
+      <w:r>
+        <w:drawing>
+          <wp:inline xmlns:a="http://schemas.openxmlformats.org/drawingml/2006/main" xmlns:pic="http://schemas.openxmlformats.org/drawingml/2006/picture">
+            <wp:extent cx="5486400" cy="6000896"/>
+            <wp:docPr id="3" name="Picture 3"/>
+            <wp:cNvGraphicFramePr>
+              <a:graphicFrameLocks noChangeAspect="1"/>
+            </wp:cNvGraphicFramePr>
+            <a:graphic>
+              <a:graphicData uri="http://schemas.openxmlformats.org/drawingml/2006/picture">
+                <pic:pic>
+                  <pic:nvPicPr>
+                    <pic:cNvPr id="0" name="captain-proxy-entry.png"/>
+                    <pic:cNvPicPr/>
+                  </pic:nvPicPr>
+                  <pic:blipFill>
+                    <a:blip r:embed="rId13"/>
+                    <a:stretch>
+                      <a:fillRect/>
+                    </a:stretch>
+                  </pic:blipFill>
+                  <pic:spPr>
+                    <a:xfrm>
+                      <a:off x="0" y="0"/>
+                      <a:ext cx="5486400" cy="6000896"/>
+                    </a:xfrm>
+                    <a:prstGeom prst="rect"/>
+                  </pic:spPr>
+                </pic:pic>
+              </a:graphicData>
+            </a:graphic>
+          </wp:inline>
+        </w:drawing>
+      </w:r>
+    </w:p>
+    <w:p>
+      <w:pPr>
+        <w:pStyle w:val="Caption"/>
+        <w:keepNext w:val="0"/>
+        <w:keepLines/>
+        <w:jc w:val="center"/>
+      </w:pPr>
+      <w:r>
+        <w:t>Agreed proxy entry opens the opponent fields. The acting official must confirm both lineups and the final result with both teams.</w:t>
+      </w:r>
+    </w:p>
+    <w:p>
+      <w:r>
+        <w:br w:type="page"/>
+      </w:r>
+    </w:p>
+    <w:p>
+      <w:pPr>
+        <w:pStyle w:val="Heading1"/>
+        <w:keepNext/>
+        <w:keepLines/>
+      </w:pPr>
+      <w:r>
+        <w:t>Two player winter lineup</w:t>
+      </w:r>
+    </w:p>
+    <w:p>
+      <w:pPr>
+        <w:keepNext/>
+        <w:keepLines/>
+      </w:pPr>
+      <w:r>
+        <w:t>Choose two different players in Frames 1 and 2, then select No Show in Frame 3. A confirmation explains the consequences before anything changes.</w:t>
+      </w:r>
+    </w:p>
+    <w:p>
+      <w:pPr>
+        <w:keepNext w:val="0"/>
+        <w:keepLines/>
+        <w:spacing w:before="60"/>
+        <w:jc w:val="center"/>
+      </w:pPr>
+      <w:r>
+        <w:drawing>
+          <wp:inline xmlns:a="http://schemas.openxmlformats.org/drawingml/2006/main" xmlns:pic="http://schemas.openxmlformats.org/drawingml/2006/picture">
+            <wp:extent cx="5486400" cy="6459265"/>
+            <wp:docPr id="4" name="Picture 4"/>
+            <wp:cNvGraphicFramePr>
+              <a:graphicFrameLocks noChangeAspect="1"/>
+            </wp:cNvGraphicFramePr>
+            <a:graphic>
+              <a:graphicData uri="http://schemas.openxmlformats.org/drawingml/2006/picture">
+                <pic:pic>
+                  <pic:nvPicPr>
+                    <pic:cNvPr id="0" name="captain-winter-two-player.png"/>
+                    <pic:cNvPicPr/>
+                  </pic:nvPicPr>
+                  <pic:blipFill>
+                    <a:blip r:embed="rId14"/>
+                    <a:stretch>
+                      <a:fillRect/>
+                    </a:stretch>
+                  </pic:blipFill>
+                  <pic:spPr>
+                    <a:xfrm>
+                      <a:off x="0" y="0"/>
+                      <a:ext cx="5486400" cy="6459265"/>
+                    </a:xfrm>
+                    <a:prstGeom prst="rect"/>
+                  </pic:spPr>
+                </pic:pic>
+              </a:graphicData>
+            </a:graphic>
+          </wp:inline>
+        </w:drawing>
+      </w:r>
+    </w:p>
+    <w:p>
+      <w:pPr>
+        <w:pStyle w:val="Caption"/>
+        <w:keepNext w:val="0"/>
+        <w:keepLines/>
+        <w:jc w:val="center"/>
+      </w:pPr>
+      <w:r>
+        <w:t>After confirmation, Frame 3 is No Show, the system randomly names the nominated player for Frame 4, and both available players fill the doubles automatically.</w:t>
+      </w:r>
+    </w:p>
+    <w:p>
+      <w:r>
+        <w:br w:type="page"/>
+      </w:r>
+    </w:p>
+    <w:p>
+      <w:pPr>
+        <w:pStyle w:val="Heading1"/>
+        <w:keepNext/>
+        <w:keepLines/>
+      </w:pPr>
+      <w:r>
+        <w:t>Three player winter lineup</w:t>
+      </w:r>
+    </w:p>
+    <w:p>
+      <w:pPr>
+        <w:keepNext/>
+        <w:keepLines/>
+      </w:pPr>
+      <w:r>
+        <w:t>Choose three different players in Frames 1 to 3, then choose Nominated player in Frame 4 and acknowledge the confirmation.</w:t>
+      </w:r>
+    </w:p>
+    <w:p>
+      <w:pPr>
+        <w:keepNext w:val="0"/>
+        <w:keepLines/>
+        <w:spacing w:before="60"/>
+        <w:jc w:val="center"/>
+      </w:pPr>
+      <w:r>
+        <w:drawing>
+          <wp:inline xmlns:a="http://schemas.openxmlformats.org/drawingml/2006/main" xmlns:pic="http://schemas.openxmlformats.org/drawingml/2006/picture">
+            <wp:extent cx="5486400" cy="6459265"/>
+            <wp:docPr id="5" name="Picture 5"/>
+            <wp:cNvGraphicFramePr>
+              <a:graphicFrameLocks noChangeAspect="1"/>
+            </wp:cNvGraphicFramePr>
+            <a:graphic>
+              <a:graphicData uri="http://schemas.openxmlformats.org/drawingml/2006/picture">
+                <pic:pic>
+                  <pic:nvPicPr>
+                    <pic:cNvPr id="0" name="captain-winter-three-player.png"/>
+                    <pic:cNvPicPr/>
+                  </pic:nvPicPr>
+                  <pic:blipFill>
+                    <a:blip r:embed="rId15"/>
+                    <a:stretch>
+                      <a:fillRect/>
+                    </a:stretch>
+                  </pic:blipFill>
+                  <pic:spPr>
+                    <a:xfrm>
+                      <a:off x="0" y="0"/>
+                      <a:ext cx="5486400" cy="6459265"/>
+                    </a:xfrm>
+                    <a:prstGeom prst="rect"/>
+                  </pic:spPr>
+                </pic:pic>
+              </a:graphicData>
+            </a:graphic>
+          </wp:inline>
+        </w:drawing>
+      </w:r>
+    </w:p>
+    <w:p>
+      <w:pPr>
+        <w:pStyle w:val="Caption"/>
+        <w:keepNext w:val="0"/>
+        <w:keepLines/>
+        <w:jc w:val="center"/>
+      </w:pPr>
+      <w:r>
+        <w:t>The system randomly names the nominated player for Frame 4. The captain then chooses any two of the first three players for the doubles.</w:t>
       </w:r>
     </w:p>
     <w:p>
@@ -726,19 +937,197 @@
         <w:pStyle w:val="Heading1"/>
       </w:pPr>
       <w:r>
-        <w:t>Check the fixture status</w:t>
+        <w:t>Lineup rules and checks</w:t>
       </w:r>
     </w:p>
     <w:p>
       <w:pPr>
-        <w:spacing w:before="80" w:after="60"/>
+        <w:pStyle w:val="Heading2"/>
+      </w:pPr>
+      <w:r>
+        <w:t>Four players available</w:t>
+      </w:r>
+    </w:p>
+    <w:p>
+      <w:pPr>
+        <w:pStyle w:val="ListBullet"/>
+        <w:keepNext w:val="0"/>
+        <w:keepLines/>
+      </w:pPr>
+      <w:r>
+        <w:t>Use four different players across Frames 1 to 4.</w:t>
+      </w:r>
+    </w:p>
+    <w:p>
+      <w:pPr>
+        <w:pStyle w:val="ListBullet"/>
+        <w:keepNext w:val="0"/>
+        <w:keepLines/>
+      </w:pPr>
+      <w:r>
+        <w:t>Choose the doubles pair in Frame 5 and review the complete lineup before submitting.</w:t>
+      </w:r>
+    </w:p>
+    <w:p>
+      <w:pPr>
+        <w:pStyle w:val="Heading2"/>
+      </w:pPr>
+      <w:r>
+        <w:t>Only three players available</w:t>
+      </w:r>
+    </w:p>
+    <w:p>
+      <w:pPr>
+        <w:pStyle w:val="ListBullet"/>
+        <w:keepNext w:val="0"/>
+        <w:keepLines/>
+      </w:pPr>
+      <w:r>
+        <w:t>Use three different players in Frames 1 to 3.</w:t>
+      </w:r>
+    </w:p>
+    <w:p>
+      <w:pPr>
+        <w:pStyle w:val="ListBullet"/>
+        <w:keepNext w:val="0"/>
+        <w:keepLines/>
+      </w:pPr>
+      <w:r>
+        <w:t>Choose Nominated player in Frame 4 and confirm that only three players are available.</w:t>
+      </w:r>
+    </w:p>
+    <w:p>
+      <w:pPr>
+        <w:pStyle w:val="ListBullet"/>
+        <w:keepNext w:val="0"/>
+        <w:keepLines/>
+      </w:pPr>
+      <w:r>
+        <w:t>The system randomly nominates one of the first three players and displays the player's name followed by nominated player in brackets.</w:t>
+      </w:r>
+    </w:p>
+    <w:p>
+      <w:pPr>
+        <w:pStyle w:val="ListBullet"/>
+        <w:keepNext w:val="0"/>
+        <w:keepLines/>
+      </w:pPr>
+      <w:r>
+        <w:t>Choose any two of those three players for the doubles.</w:t>
+      </w:r>
+    </w:p>
+    <w:p>
+      <w:pPr>
+        <w:pStyle w:val="Heading2"/>
+      </w:pPr>
+      <w:r>
+        <w:t>Only two players available</w:t>
+      </w:r>
+    </w:p>
+    <w:p>
+      <w:pPr>
+        <w:pStyle w:val="ListBullet"/>
+        <w:keepNext w:val="0"/>
+        <w:keepLines/>
+      </w:pPr>
+      <w:r>
+        <w:t>Use two different players in Frames 1 and 2.</w:t>
+      </w:r>
+    </w:p>
+    <w:p>
+      <w:pPr>
+        <w:pStyle w:val="ListBullet"/>
+        <w:keepNext w:val="0"/>
+        <w:keepLines/>
+      </w:pPr>
+      <w:r>
+        <w:t>Choose No Show in Frame 3 and acknowledge the confirmation.</w:t>
+      </w:r>
+    </w:p>
+    <w:p>
+      <w:pPr>
+        <w:pStyle w:val="ListBullet"/>
+        <w:keepNext w:val="0"/>
+        <w:keepLines/>
+      </w:pPr>
+      <w:r>
+        <w:t>The system randomly nominates one of the two players for Frame 4 and automatically places both players in the doubles.</w:t>
+      </w:r>
+    </w:p>
+    <w:p>
+      <w:pPr>
+        <w:pStyle w:val="Heading2"/>
+      </w:pPr>
+      <w:r>
+        <w:t>Submitting the lineup</w:t>
+      </w:r>
+    </w:p>
+    <w:p>
+      <w:pPr>
+        <w:pStyle w:val="ListBullet"/>
+        <w:keepNext w:val="0"/>
+        <w:keepLines/>
+      </w:pPr>
+      <w:r>
+        <w:t>Save lineup draft keeps unfinished work on the device.</w:t>
+      </w:r>
+    </w:p>
+    <w:p>
+      <w:pPr>
+        <w:pStyle w:val="ListBullet"/>
+        <w:keepNext w:val="0"/>
+        <w:keepLines/>
+      </w:pPr>
+      <w:r>
+        <w:t>Submit team to opponent only when the home lineup is final. Away then checks and confirms it.</w:t>
+      </w:r>
+    </w:p>
+    <w:p>
+      <w:pPr>
+        <w:pStyle w:val="ListBullet"/>
+        <w:keepNext w:val="0"/>
+        <w:keepLines/>
+      </w:pPr>
+      <w:r>
+        <w:t>The same player cannot be manually selected in more than one ordinary winter singles frame. A system-nominated Frame 4 is the permitted exception.</w:t>
+      </w:r>
+    </w:p>
+    <w:p>
+      <w:r>
+        <w:br w:type="page"/>
+      </w:r>
+    </w:p>
+    <w:p>
+      <w:pPr>
+        <w:pStyle w:val="Heading1"/>
+        <w:keepNext/>
+        <w:keepLines/>
+      </w:pPr>
+      <w:r>
+        <w:t>Review and submit the result</w:t>
+      </w:r>
+    </w:p>
+    <w:p>
+      <w:pPr>
+        <w:keepNext/>
+        <w:keepLines/>
+      </w:pPr>
+      <w:r>
+        <w:t>Once both lineups are locked, enter each completed frame, add every break of 30 or more, and save as you progress. After the final frame, review the full scorecard with both teams.</w:t>
+      </w:r>
+    </w:p>
+    <w:p>
+      <w:pPr>
+        <w:keepNext w:val="0"/>
+        <w:keepLines/>
+        <w:spacing w:before="60"/>
         <w:jc w:val="center"/>
       </w:pPr>
       <w:r>
         <w:drawing>
           <wp:inline xmlns:a="http://schemas.openxmlformats.org/drawingml/2006/main" xmlns:pic="http://schemas.openxmlformats.org/drawingml/2006/picture">
-            <wp:extent cx="5303520" cy="6309020"/>
-            <wp:docPr id="3" name="Picture 3" descr="Selected fixture status showing the open submission window and draft in progress" title="Selected fixture status showing the open submission window and draft in progress"/>
+            <wp:extent cx="5486400" cy="3087998"/>
+            <wp:docPr id="6" name="Picture 6"/>
             <wp:cNvGraphicFramePr>
               <a:graphicFrameLocks noChangeAspect="1"/>
             </wp:cNvGraphicFramePr>
@@ -746,11 +1135,11 @@
               <a:graphicData uri="http://schemas.openxmlformats.org/drawingml/2006/picture">
                 <pic:pic>
                   <pic:nvPicPr>
-                    <pic:cNvPr id="0" name="rf-captain-step-2.png"/>
+                    <pic:cNvPr id="0" name="captain-final-scorecard-complete.png"/>
                     <pic:cNvPicPr/>
                   </pic:nvPicPr>
                   <pic:blipFill>
-                    <a:blip r:embed="rId13"/>
+                    <a:blip r:embed="rId16"/>
                     <a:stretch>
                       <a:fillRect/>
                     </a:stretch>
@@ -758,7 +1147,7 @@
                   <pic:spPr>
                     <a:xfrm>
                       <a:off x="0" y="0"/>
-                      <a:ext cx="5303520" cy="6309020"/>
+                      <a:ext cx="5486400" cy="3087998"/>
                     </a:xfrm>
                     <a:prstGeom prst="rect"/>
                   </pic:spPr>
@@ -771,17 +1160,13 @@
     </w:p>
     <w:p>
       <w:pPr>
-        <w:spacing w:after="140"/>
+        <w:pStyle w:val="Caption"/>
+        <w:keepNext w:val="0"/>
+        <w:keepLines/>
         <w:jc w:val="center"/>
       </w:pPr>
       <w:r>
-        <w:rPr>
-          <w:rFonts w:ascii="Aptos" w:hAnsi="Aptos"/>
-          <w:i/>
-          <w:color w:val="5F6B76"/>
-          <w:sz w:val="19"/>
-        </w:rPr>
-        <w:t>Check the selected fixture, submission window and current status before entering players.</w:t>
+        <w:t>Check player names, all five frame scores and qualifying breaks before selecting Submit match result.</w:t>
       </w:r>
     </w:p>
     <w:p>
@@ -794,809 +1179,126 @@
         <w:pStyle w:val="Heading1"/>
       </w:pPr>
       <w:r>
-        <w:t>Entering and sending the lineup</w:t>
+        <w:t>Complete match night process</w:t>
       </w:r>
     </w:p>
     <w:p>
       <w:pPr>
-        <w:spacing w:before="80" w:after="60"/>
-        <w:jc w:val="center"/>
+        <w:keepNext w:val="0"/>
+        <w:keepLines/>
+        <w:spacing w:after="120"/>
       </w:pPr>
       <w:r>
-        <w:drawing>
-          <wp:inline xmlns:a="http://schemas.openxmlformats.org/drawingml/2006/main" xmlns:pic="http://schemas.openxmlformats.org/drawingml/2006/picture">
-            <wp:extent cx="5303520" cy="6309020"/>
-            <wp:docPr id="4" name="Picture 4" descr="Lineup entry screen showing home team first and away team waiting" title="Lineup entry screen showing home team first and away team waiting"/>
-            <wp:cNvGraphicFramePr>
-              <a:graphicFrameLocks noChangeAspect="1"/>
-            </wp:cNvGraphicFramePr>
-            <a:graphic>
-              <a:graphicData uri="http://schemas.openxmlformats.org/drawingml/2006/picture">
-                <pic:pic>
-                  <pic:nvPicPr>
-                    <pic:cNvPr id="0" name="rf-captain-step-3.png"/>
-                    <pic:cNvPicPr/>
-                  </pic:nvPicPr>
-                  <pic:blipFill>
-                    <a:blip r:embed="rId14"/>
-                    <a:stretch>
-                      <a:fillRect/>
-                    </a:stretch>
-                  </pic:blipFill>
-                  <pic:spPr>
-                    <a:xfrm>
-                      <a:off x="0" y="0"/>
-                      <a:ext cx="5303520" cy="6309020"/>
-                    </a:xfrm>
-                    <a:prstGeom prst="rect"/>
-                  </pic:spPr>
-                </pic:pic>
-              </a:graphicData>
-            </a:graphic>
-          </wp:inline>
-        </w:drawing>
+        <w:rPr>
+          <w:b/>
+          <w:color w:val="0F766E"/>
+        </w:rPr>
+        <w:t xml:space="preserve">1  Open Captain Results  </w:t>
+      </w:r>
+      <w:r>
+        <w:t>Select tonight's fixture and confirm the teams, date and lineup status.</w:t>
       </w:r>
     </w:p>
     <w:p>
       <w:pPr>
-        <w:spacing w:after="140"/>
-        <w:jc w:val="center"/>
+        <w:keepNext w:val="0"/>
+        <w:keepLines/>
+        <w:spacing w:after="120"/>
       </w:pPr>
       <w:r>
         <w:rPr>
-          <w:rFonts w:ascii="Aptos" w:hAnsi="Aptos"/>
-          <w:i/>
-          <w:color w:val="5F6B76"/>
-          <w:sz w:val="19"/>
+          <w:b/>
+          <w:color w:val="0F766E"/>
         </w:rPr>
-        <w:t>The screen confirms who acts first. Home sends the lineup; away confirms after receiving it.</w:t>
+        <w:t xml:space="preserve">2  Decide whether proxy entry is needed  </w:t>
       </w:r>
-    </w:p>
-    <w:p>
       <w:r>
-        <w:br w:type="page"/>
+        <w:t>If both sides agree that one official will operate the app, enable agreed proxy entry before choosing players.</w:t>
       </w:r>
     </w:p>
     <w:p>
       <w:pPr>
-        <w:pStyle w:val="Heading1"/>
+        <w:keepNext w:val="0"/>
+        <w:keepLines/>
+        <w:spacing w:after="120"/>
       </w:pPr>
       <w:r>
-        <w:t>Choose and submit the players</w:t>
+        <w:rPr>
+          <w:b/>
+          <w:color w:val="0F766E"/>
+        </w:rPr>
+        <w:t xml:space="preserve">3  Enter the lineups  </w:t>
+      </w:r>
+      <w:r>
+        <w:t>Follow the four-player, three-player or two-player winter route. Home submits first unless proxy entry is active.</w:t>
       </w:r>
     </w:p>
     <w:p>
       <w:pPr>
-        <w:spacing w:before="80" w:after="60"/>
-        <w:jc w:val="center"/>
+        <w:keepNext w:val="0"/>
+        <w:keepLines/>
+        <w:spacing w:after="120"/>
       </w:pPr>
       <w:r>
-        <w:drawing>
-          <wp:inline xmlns:a="http://schemas.openxmlformats.org/drawingml/2006/main" xmlns:pic="http://schemas.openxmlformats.org/drawingml/2006/picture">
-            <wp:extent cx="5303520" cy="6309020"/>
-            <wp:docPr id="5" name="Picture 5" descr="Frame player selectors with Save draft and Submit lineup controls" title="Frame player selectors with Save draft and Submit lineup controls"/>
-            <wp:cNvGraphicFramePr>
-              <a:graphicFrameLocks noChangeAspect="1"/>
-            </wp:cNvGraphicFramePr>
-            <a:graphic>
-              <a:graphicData uri="http://schemas.openxmlformats.org/drawingml/2006/picture">
-                <pic:pic>
-                  <pic:nvPicPr>
-                    <pic:cNvPr id="0" name="rf-captain-step-4.png"/>
-                    <pic:cNvPicPr/>
-                  </pic:nvPicPr>
-                  <pic:blipFill>
-                    <a:blip r:embed="rId15"/>
-                    <a:stretch>
-                      <a:fillRect/>
-                    </a:stretch>
-                  </pic:blipFill>
-                  <pic:spPr>
-                    <a:xfrm>
-                      <a:off x="0" y="0"/>
-                      <a:ext cx="5303520" cy="6309020"/>
-                    </a:xfrm>
-                    <a:prstGeom prst="rect"/>
-                  </pic:spPr>
-                </pic:pic>
-              </a:graphicData>
-            </a:graphic>
-          </wp:inline>
-        </w:drawing>
+        <w:rPr>
+          <w:b/>
+          <w:color w:val="0F766E"/>
+        </w:rPr>
+        <w:t xml:space="preserve">4  Open the scorecard  </w:t>
+      </w:r>
+      <w:r>
+        <w:t>After both lineups are locked, check the players shown for the first frame.</w:t>
       </w:r>
     </w:p>
     <w:p>
       <w:pPr>
-        <w:spacing w:after="140"/>
-        <w:jc w:val="center"/>
+        <w:keepNext w:val="0"/>
+        <w:keepLines/>
+        <w:spacing w:after="120"/>
       </w:pPr>
       <w:r>
         <w:rPr>
-          <w:rFonts w:ascii="Aptos" w:hAnsi="Aptos"/>
-          <w:i/>
-          <w:color w:val="5F6B76"/>
-          <w:sz w:val="19"/>
+          <w:b/>
+          <w:color w:val="0F766E"/>
         </w:rPr>
-        <w:t>Choose the correct player in each frame. Save draft keeps work in progress; Submit lineup sends the final lineup.</w:t>
+        <w:t xml:space="preserve">5  Save every completed frame  </w:t>
       </w:r>
-    </w:p>
-    <w:p>
       <w:r>
-        <w:br w:type="page"/>
+        <w:t>Enter both scores, record any break of 30 or more and continue through all five frames.</w:t>
       </w:r>
     </w:p>
     <w:p>
       <w:pPr>
-        <w:pStyle w:val="Heading1"/>
+        <w:keepNext w:val="0"/>
+        <w:keepLines/>
+        <w:spacing w:after="120"/>
       </w:pPr>
       <w:r>
-        <w:t>Entering frame scores and breaks</w:t>
+        <w:rPr>
+          <w:b/>
+          <w:color w:val="0F766E"/>
+        </w:rPr>
+        <w:t xml:space="preserve">6  Review with both teams  </w:t>
       </w:r>
-    </w:p>
-    <w:p>
       <w:r>
-        <w:t>The remaining screenshots use sample players in a safe training fixture. Nothing shown here was saved to the live league, but the controls and order match the real match-night process.</w:t>
+        <w:t>Check every player, score and break before final submission.</w:t>
       </w:r>
     </w:p>
     <w:p>
       <w:pPr>
-        <w:spacing w:before="80" w:after="60"/>
-        <w:jc w:val="center"/>
-      </w:pPr>
-      <w:r>
-        <w:drawing>
-          <wp:inline xmlns:a="http://schemas.openxmlformats.org/drawingml/2006/main" xmlns:pic="http://schemas.openxmlformats.org/drawingml/2006/picture">
-            <wp:extent cx="5303520" cy="2985064"/>
-            <wp:docPr id="6" name="Picture 6" descr="Training scorecard showing Step 2, a completed frame and the Save completed frame control" title="Training scorecard showing Step 2, a completed frame and the Save completed frame control"/>
-            <wp:cNvGraphicFramePr>
-              <a:graphicFrameLocks noChangeAspect="1"/>
-            </wp:cNvGraphicFramePr>
-            <a:graphic>
-              <a:graphicData uri="http://schemas.openxmlformats.org/drawingml/2006/picture">
-                <pic:pic>
-                  <pic:nvPicPr>
-                    <pic:cNvPr id="0" name="rf-training-scorecard.png"/>
-                    <pic:cNvPicPr/>
-                  </pic:nvPicPr>
-                  <pic:blipFill>
-                    <a:blip r:embed="rId16"/>
-                    <a:stretch>
-                      <a:fillRect/>
-                    </a:stretch>
-                  </pic:blipFill>
-                  <pic:spPr>
-                    <a:xfrm>
-                      <a:off x="0" y="0"/>
-                      <a:ext cx="5303520" cy="2985064"/>
-                    </a:xfrm>
-                    <a:prstGeom prst="rect"/>
-                  </pic:spPr>
-                </pic:pic>
-              </a:graphicData>
-            </a:graphic>
-          </wp:inline>
-        </w:drawing>
-      </w:r>
-    </w:p>
-    <w:p>
-      <w:pPr>
-        <w:spacing w:after="140"/>
-        <w:jc w:val="center"/>
+        <w:keepNext w:val="0"/>
+        <w:keepLines/>
+        <w:spacing w:after="120"/>
       </w:pPr>
       <w:r>
         <w:rPr>
-          <w:rFonts w:ascii="Aptos" w:hAnsi="Aptos"/>
-          <w:i/>
-          <w:color w:val="5F6B76"/>
-          <w:sz w:val="19"/>
+          <w:b/>
+          <w:color w:val="0F766E"/>
         </w:rPr>
-        <w:t>After both lineups are locked, open Step 2: Scorecard. For each completed frame, check the players, enter both scores and select Save completed frame.</w:t>
-      </w:r>
-    </w:p>
-    <w:p>
-      <w:r>
-        <w:br w:type="page"/>
-      </w:r>
-    </w:p>
-    <w:p>
-      <w:pPr>
-        <w:pStyle w:val="Heading1"/>
-      </w:pPr>
-      <w:r>
-        <w:t>Recording a break of 30 or more</w:t>
-      </w:r>
-    </w:p>
-    <w:p>
-      <w:pPr>
-        <w:spacing w:before="80" w:after="60"/>
-        <w:jc w:val="center"/>
-      </w:pPr>
-      <w:r>
-        <w:drawing>
-          <wp:inline xmlns:a="http://schemas.openxmlformats.org/drawingml/2006/main" xmlns:pic="http://schemas.openxmlformats.org/drawingml/2006/picture">
-            <wp:extent cx="5303520" cy="2985064"/>
-            <wp:docPr id="7" name="Picture 7" descr="Break entry fields showing the player and a break of 42" title="Break entry fields showing the player and a break of 42"/>
-            <wp:cNvGraphicFramePr>
-              <a:graphicFrameLocks noChangeAspect="1"/>
-            </wp:cNvGraphicFramePr>
-            <a:graphic>
-              <a:graphicData uri="http://schemas.openxmlformats.org/drawingml/2006/picture">
-                <pic:pic>
-                  <pic:nvPicPr>
-                    <pic:cNvPr id="0" name="rf-training-break-entry.png"/>
-                    <pic:cNvPicPr/>
-                  </pic:nvPicPr>
-                  <pic:blipFill>
-                    <a:blip r:embed="rId17"/>
-                    <a:stretch>
-                      <a:fillRect/>
-                    </a:stretch>
-                  </pic:blipFill>
-                  <pic:spPr>
-                    <a:xfrm>
-                      <a:off x="0" y="0"/>
-                      <a:ext cx="5303520" cy="2985064"/>
-                    </a:xfrm>
-                    <a:prstGeom prst="rect"/>
-                  </pic:spPr>
-                </pic:pic>
-              </a:graphicData>
-            </a:graphic>
-          </wp:inline>
-        </w:drawing>
-      </w:r>
-    </w:p>
-    <w:p>
-      <w:pPr>
-        <w:spacing w:after="140"/>
-        <w:jc w:val="center"/>
-      </w:pPr>
-      <w:r>
-        <w:rPr>
-          <w:rFonts w:ascii="Aptos" w:hAnsi="Aptos"/>
-          <w:i/>
-          <w:color w:val="5F6B76"/>
-          <w:sz w:val="19"/>
-        </w:rPr>
-        <w:t>For a break of 30 or more, select Add break 30+, choose the player and enter the break before saving the frame.</w:t>
-      </w:r>
-    </w:p>
-    <w:p>
-      <w:r>
-        <w:br w:type="page"/>
-      </w:r>
-    </w:p>
-    <w:p>
-      <w:pPr>
-        <w:pStyle w:val="Heading1"/>
-      </w:pPr>
-      <w:r>
-        <w:t>Reviewing and submitting the result</w:t>
-      </w:r>
-    </w:p>
-    <w:p>
-      <w:pPr>
-        <w:spacing w:before="80" w:after="60"/>
-        <w:jc w:val="center"/>
-      </w:pPr>
-      <w:r>
-        <w:drawing>
-          <wp:inline xmlns:a="http://schemas.openxmlformats.org/drawingml/2006/main" xmlns:pic="http://schemas.openxmlformats.org/drawingml/2006/picture">
-            <wp:extent cx="5303520" cy="2985064"/>
-            <wp:docPr id="8" name="Picture 8" descr="Final review showing four frames, player names, scores and a recorded break" title="Final review showing four frames, player names, scores and a recorded break"/>
-            <wp:cNvGraphicFramePr>
-              <a:graphicFrameLocks noChangeAspect="1"/>
-            </wp:cNvGraphicFramePr>
-            <a:graphic>
-              <a:graphicData uri="http://schemas.openxmlformats.org/drawingml/2006/picture">
-                <pic:pic>
-                  <pic:nvPicPr>
-                    <pic:cNvPr id="0" name="rf-training-final-review-for-doc.png"/>
-                    <pic:cNvPicPr/>
-                  </pic:nvPicPr>
-                  <pic:blipFill>
-                    <a:blip r:embed="rId18"/>
-                    <a:stretch>
-                      <a:fillRect/>
-                    </a:stretch>
-                  </pic:blipFill>
-                  <pic:spPr>
-                    <a:xfrm>
-                      <a:off x="0" y="0"/>
-                      <a:ext cx="5303520" cy="2985064"/>
-                    </a:xfrm>
-                    <a:prstGeom prst="rect"/>
-                  </pic:spPr>
-                </pic:pic>
-              </a:graphicData>
-            </a:graphic>
-          </wp:inline>
-        </w:drawing>
-      </w:r>
-    </w:p>
-    <w:p>
-      <w:pPr>
-        <w:spacing w:after="140"/>
-        <w:jc w:val="center"/>
-      </w:pPr>
-      <w:r>
-        <w:rPr>
-          <w:rFonts w:ascii="Aptos" w:hAnsi="Aptos"/>
-          <w:i/>
-          <w:color w:val="5F6B76"/>
-          <w:sz w:val="19"/>
-        </w:rPr>
-        <w:t>At Step 3: Final review, check every player, score and qualifying break with both teams. Correct anything that is wrong before submitting.</w:t>
-      </w:r>
-    </w:p>
-    <w:p>
-      <w:r>
-        <w:br w:type="page"/>
-      </w:r>
-    </w:p>
-    <w:p>
-      <w:pPr>
-        <w:pStyle w:val="Heading1"/>
-      </w:pPr>
-      <w:r>
-        <w:t>Submission confirmation</w:t>
-      </w:r>
-    </w:p>
-    <w:p>
-      <w:pPr>
-        <w:spacing w:before="80" w:after="60"/>
-        <w:jc w:val="center"/>
-      </w:pPr>
-      <w:r>
-        <w:drawing>
-          <wp:inline xmlns:a="http://schemas.openxmlformats.org/drawingml/2006/main" xmlns:pic="http://schemas.openxmlformats.org/drawingml/2006/picture">
-            <wp:extent cx="5303520" cy="2985064"/>
-            <wp:docPr id="9" name="Picture 9" descr="Training submission confirmation explaining that a live result enters the approval queue" title="Training submission confirmation explaining that a live result enters the approval queue"/>
-            <wp:cNvGraphicFramePr>
-              <a:graphicFrameLocks noChangeAspect="1"/>
-            </wp:cNvGraphicFramePr>
-            <a:graphic>
-              <a:graphicData uri="http://schemas.openxmlformats.org/drawingml/2006/picture">
-                <pic:pic>
-                  <pic:nvPicPr>
-                    <pic:cNvPr id="0" name="rf-training-submission-confirmation-for-doc.png"/>
-                    <pic:cNvPicPr/>
-                  </pic:nvPicPr>
-                  <pic:blipFill>
-                    <a:blip r:embed="rId19"/>
-                    <a:stretch>
-                      <a:fillRect/>
-                    </a:stretch>
-                  </pic:blipFill>
-                  <pic:spPr>
-                    <a:xfrm>
-                      <a:off x="0" y="0"/>
-                      <a:ext cx="5303520" cy="2985064"/>
-                    </a:xfrm>
-                    <a:prstGeom prst="rect"/>
-                  </pic:spPr>
-                </pic:pic>
-              </a:graphicData>
-            </a:graphic>
-          </wp:inline>
-        </w:drawing>
-      </w:r>
-    </w:p>
-    <w:p>
-      <w:pPr>
-        <w:spacing w:after="140"/>
-        <w:jc w:val="center"/>
-      </w:pPr>
-      <w:r>
-        <w:rPr>
-          <w:rFonts w:ascii="Aptos" w:hAnsi="Aptos"/>
-          <w:i/>
-          <w:color w:val="5F6B76"/>
-          <w:sz w:val="19"/>
-        </w:rPr>
-        <w:t>Select Submit match result once both teams agree the card is correct. A live result then enters the league-officer approval queue.</w:t>
-      </w:r>
-    </w:p>
-    <w:p>
-      <w:r>
-        <w:br w:type="page"/>
-      </w:r>
-    </w:p>
-    <w:p>
-      <w:pPr>
-        <w:pStyle w:val="Heading1"/>
-      </w:pPr>
-      <w:r>
-        <w:t>Before the match</w:t>
-      </w:r>
-    </w:p>
-    <w:p>
-      <w:pPr>
-        <w:ind w:left="259" w:hanging="259"/>
-      </w:pPr>
-      <w:r>
-        <w:rPr>
-          <w:rFonts w:ascii="Aptos" w:hAnsi="Aptos"/>
-          <w:b/>
-          <w:color w:val="147D78"/>
-        </w:rPr>
-        <w:t xml:space="preserve">Check access  </w:t>
+        <w:t xml:space="preserve">7  Submit the result  </w:t>
       </w:r>
       <w:r>
-        <w:t>Sign in with your usual account. If Captain Results or the fixture is missing, ask a league officer to check your role rather than creating another account.</w:t>
-      </w:r>
-    </w:p>
-    <w:p>
-      <w:pPr>
-        <w:ind w:left="259" w:hanging="259"/>
-      </w:pPr>
-      <w:r>
-        <w:rPr>
-          <w:rFonts w:ascii="Aptos" w:hAnsi="Aptos"/>
-          <w:b/>
-          <w:color w:val="147D78"/>
-        </w:rPr>
-        <w:t xml:space="preserve">Read notifications  </w:t>
-      </w:r>
-      <w:r>
-        <w:t>Check lineup prompts, fixture reminders and league messages.</w:t>
-      </w:r>
-    </w:p>
-    <w:p>
-      <w:pPr>
-        <w:ind w:left="259" w:hanging="259"/>
-      </w:pPr>
-      <w:r>
-        <w:rPr>
-          <w:rFonts w:ascii="Aptos" w:hAnsi="Aptos"/>
-          <w:b/>
-          <w:color w:val="147D78"/>
-        </w:rPr>
-        <w:t xml:space="preserve">Open the fixture  </w:t>
-      </w:r>
-      <w:r>
-        <w:t>In Captain Results, select the correct match and confirm the teams and date.</w:t>
-      </w:r>
-    </w:p>
-    <w:p>
-      <w:pPr>
-        <w:ind w:left="259" w:hanging="259"/>
-      </w:pPr>
-      <w:r>
-        <w:rPr>
-          <w:rFonts w:ascii="Aptos" w:hAnsi="Aptos"/>
-          <w:b/>
-          <w:color w:val="147D78"/>
-        </w:rPr>
-        <w:t xml:space="preserve">Home submits first  </w:t>
-      </w:r>
-      <w:r>
-        <w:t>The home captain or vice-captain enters and submits the home lineup on the day of the fixture.</w:t>
-      </w:r>
-    </w:p>
-    <w:p>
-      <w:pPr>
-        <w:ind w:left="259" w:hanging="259"/>
-      </w:pPr>
-      <w:r>
-        <w:rPr>
-          <w:rFonts w:ascii="Aptos" w:hAnsi="Aptos"/>
-          <w:b/>
-          <w:color w:val="147D78"/>
-        </w:rPr>
-        <w:t xml:space="preserve">Away responds  </w:t>
-      </w:r>
-      <w:r>
-        <w:t>The away captain receives a notification and submits the away lineup.</w:t>
-      </w:r>
-    </w:p>
-    <w:p>
-      <w:pPr>
-        <w:ind w:left="259" w:hanging="259"/>
-      </w:pPr>
-      <w:r>
-        <w:rPr>
-          <w:rFonts w:ascii="Aptos" w:hAnsi="Aptos"/>
-          <w:b/>
-          <w:color w:val="147D78"/>
-        </w:rPr>
-        <w:t xml:space="preserve">Meet the deadline  </w:t>
-      </w:r>
-      <w:r>
-        <w:t>Complete required digital lineup activity before 19:30.</w:t>
-      </w:r>
-    </w:p>
-    <w:p>
-      <w:pPr>
-        <w:pStyle w:val="Heading1"/>
-      </w:pPr>
-      <w:r>
-        <w:t>Lineup checks</w:t>
-      </w:r>
-    </w:p>
-    <w:p>
-      <w:pPr>
-        <w:pStyle w:val="ListBullet"/>
-        <w:spacing w:after="80"/>
-      </w:pPr>
-      <w:r>
-        <w:t>Select each player carefully and confirm the order before submitting.</w:t>
-      </w:r>
-    </w:p>
-    <w:p>
-      <w:pPr>
-        <w:pStyle w:val="ListBullet"/>
-        <w:spacing w:after="80"/>
-      </w:pPr>
-      <w:r>
-        <w:t>Player selectors display current handicaps where relevant.</w:t>
-      </w:r>
-    </w:p>
-    <w:p>
-      <w:pPr>
-        <w:pStyle w:val="ListBullet"/>
-        <w:spacing w:after="80"/>
-      </w:pPr>
-      <w:r>
-        <w:t>Once both teams submit, the lineups lock and feed into the result card.</w:t>
-      </w:r>
-    </w:p>
-    <w:p>
-      <w:pPr>
-        <w:pStyle w:val="ListBullet"/>
-        <w:spacing w:after="80"/>
-      </w:pPr>
-      <w:r>
-        <w:t>If both teams agree to use paper for the lineup, select the paper-record option so the choice is recorded.</w:t>
-      </w:r>
-    </w:p>
-    <w:p>
-      <w:pPr>
-        <w:pStyle w:val="Heading1"/>
-      </w:pPr>
-      <w:r>
-        <w:t>Proxy entry</w:t>
-      </w:r>
-    </w:p>
-    <w:p>
-      <w:pPr>
-        <w:pStyle w:val="ListBullet"/>
-        <w:spacing w:after="80"/>
-      </w:pPr>
-      <w:r>
-        <w:t>Use proxy entry only when one side cannot operate the app and both teams agree that one captain or vice-captain will handle the fixture in the app.</w:t>
-      </w:r>
-    </w:p>
-    <w:p>
-      <w:pPr>
-        <w:pStyle w:val="ListBullet"/>
-        <w:spacing w:after="80"/>
-      </w:pPr>
-      <w:r>
-        <w:t>The acting official must still confirm both lineups and the final result with both teams.</w:t>
-      </w:r>
-    </w:p>
-    <w:p>
-      <w:pPr>
-        <w:pStyle w:val="ListBullet"/>
-        <w:spacing w:after="80"/>
-      </w:pPr>
-      <w:r>
-        <w:t>Proxy use is recorded in the audit trail and does not remove the normal submission requirements.</w:t>
-      </w:r>
-    </w:p>
-    <w:p>
-      <w:r>
-        <w:br w:type="page"/>
-      </w:r>
-    </w:p>
-    <w:p>
-      <w:pPr>
-        <w:pStyle w:val="Heading1"/>
-      </w:pPr>
-      <w:r>
-        <w:t>During the match</w:t>
-      </w:r>
-    </w:p>
-    <w:p>
-      <w:pPr>
-        <w:ind w:left="259" w:hanging="259"/>
-      </w:pPr>
-      <w:r>
-        <w:rPr>
-          <w:rFonts w:ascii="Aptos" w:hAnsi="Aptos"/>
-          <w:b/>
-          <w:color w:val="147D78"/>
-        </w:rPr>
-        <w:t xml:space="preserve">Switch to Scorecard  </w:t>
-      </w:r>
-      <w:r>
-        <w:t>The scorecard opens after both lineups are locked, or after paper record has been selected.</w:t>
-      </w:r>
-    </w:p>
-    <w:p>
-      <w:pPr>
-        <w:ind w:left="259" w:hanging="259"/>
-      </w:pPr>
-      <w:r>
-        <w:rPr>
-          <w:rFonts w:ascii="Aptos" w:hAnsi="Aptos"/>
-          <w:b/>
-          <w:color w:val="147D78"/>
-        </w:rPr>
-        <w:t xml:space="preserve">Enter frame details  </w:t>
-      </w:r>
-      <w:r>
-        <w:t>Check the players and enter the points for each completed frame.</w:t>
-      </w:r>
-    </w:p>
-    <w:p>
-      <w:pPr>
-        <w:ind w:left="259" w:hanging="259"/>
-      </w:pPr>
-      <w:r>
-        <w:rPr>
-          <w:rFonts w:ascii="Aptos" w:hAnsi="Aptos"/>
-          <w:b/>
-          <w:color w:val="147D78"/>
-        </w:rPr>
-        <w:t xml:space="preserve">Record breaks  </w:t>
-      </w:r>
-      <w:r>
-        <w:t>Add every qualifying break of 30 or more against the correct player and frame.</w:t>
-      </w:r>
-    </w:p>
-    <w:p>
-      <w:pPr>
-        <w:ind w:left="259" w:hanging="259"/>
-      </w:pPr>
-      <w:r>
-        <w:rPr>
-          <w:rFonts w:ascii="Aptos" w:hAnsi="Aptos"/>
-          <w:b/>
-          <w:color w:val="147D78"/>
-        </w:rPr>
-        <w:t xml:space="preserve">Save as you go  </w:t>
-      </w:r>
-      <w:r>
-        <w:t>Completed frames save as you advance. Current work is also retained on the device until final submission.</w:t>
-      </w:r>
-    </w:p>
-    <w:p>
-      <w:pPr>
-        <w:ind w:left="259" w:hanging="259"/>
-      </w:pPr>
-      <w:r>
-        <w:rPr>
-          <w:rFonts w:ascii="Aptos" w:hAnsi="Aptos"/>
-          <w:b/>
-          <w:color w:val="147D78"/>
-        </w:rPr>
-        <w:t xml:space="preserve">Keep play moving  </w:t>
-      </w:r>
-      <w:r>
-        <w:t>Use the same controlling device where possible, but do not delay the match to operate the app.</w:t>
-      </w:r>
-    </w:p>
-    <w:p>
-      <w:pPr>
-        <w:pStyle w:val="Heading1"/>
-      </w:pPr>
-      <w:r>
-        <w:t>League checks</w:t>
-      </w:r>
-    </w:p>
-    <w:p>
-      <w:pPr>
-        <w:pStyle w:val="ListBullet"/>
-        <w:spacing w:after="80"/>
-      </w:pPr>
-      <w:r>
-        <w:t>The 2026 and 2027 Premier League uses reviewed handicaps with a maximum playing start of 40 points.</w:t>
-      </w:r>
-    </w:p>
-    <w:p>
-      <w:pPr>
-        <w:pStyle w:val="ListBullet"/>
-        <w:spacing w:after="80"/>
-      </w:pPr>
-      <w:r>
-        <w:t>Division 1 is played off scratch, although Elo continues to be recorded in the background.</w:t>
-      </w:r>
-    </w:p>
-    <w:p>
-      <w:pPr>
-        <w:pStyle w:val="ListBullet"/>
-        <w:spacing w:after="80"/>
-      </w:pPr>
-      <w:r>
-        <w:t>For summer leagues, check the two-singles-per-player rule.</w:t>
-      </w:r>
-    </w:p>
-    <w:p>
-      <w:pPr>
-        <w:pStyle w:val="ListBullet"/>
-        <w:spacing w:after="80"/>
-      </w:pPr>
-      <w:r>
-        <w:t>For winter leagues, check nominated-player and no-show rules before submitting.</w:t>
-      </w:r>
-    </w:p>
-    <w:p>
-      <w:pPr>
-        <w:pStyle w:val="Heading1"/>
-      </w:pPr>
-      <w:r>
-        <w:t>After the final frame</w:t>
-      </w:r>
-    </w:p>
-    <w:p>
-      <w:pPr>
-        <w:ind w:left="259" w:hanging="259"/>
-      </w:pPr>
-      <w:r>
-        <w:rPr>
-          <w:rFonts w:ascii="Aptos" w:hAnsi="Aptos"/>
-          <w:b/>
-          <w:color w:val="147D78"/>
-        </w:rPr>
-        <w:t xml:space="preserve">Review  </w:t>
-      </w:r>
-      <w:r>
-        <w:t>Check all player assignments, points and breaks with the other team.</w:t>
-      </w:r>
-    </w:p>
-    <w:p>
-      <w:pPr>
-        <w:ind w:left="259" w:hanging="259"/>
-      </w:pPr>
-      <w:r>
-        <w:rPr>
-          <w:rFonts w:ascii="Aptos" w:hAnsi="Aptos"/>
-          <w:b/>
-          <w:color w:val="147D78"/>
-        </w:rPr>
-        <w:t xml:space="preserve">Submit  </w:t>
-      </w:r>
-      <w:r>
-        <w:t>The home team should normally press Submit match result unless a league officer has agreed another arrangement.</w:t>
-      </w:r>
-    </w:p>
-    <w:p>
-      <w:pPr>
-        <w:ind w:left="259" w:hanging="259"/>
-      </w:pPr>
-      <w:r>
-        <w:rPr>
-          <w:rFonts w:ascii="Aptos" w:hAnsi="Aptos"/>
-          <w:b/>
-          <w:color w:val="147D78"/>
-        </w:rPr>
-        <w:t xml:space="preserve">Meet the deadline  </w:t>
-      </w:r>
-      <w:r>
-        <w:t>Submit the completed result by midnight on the following day.</w:t>
-      </w:r>
-    </w:p>
-    <w:p>
-      <w:pPr>
-        <w:ind w:left="259" w:hanging="259"/>
-      </w:pPr>
-      <w:r>
-        <w:rPr>
-          <w:rFonts w:ascii="Aptos" w:hAnsi="Aptos"/>
-          <w:b/>
-          <w:color w:val="147D78"/>
-        </w:rPr>
-        <w:t xml:space="preserve">Wait for approval  </w:t>
-      </w:r>
-      <w:r>
-        <w:t>The submission enters the league-officer queue. Only approval updates standings, player records and Elo history.</w:t>
-      </w:r>
-    </w:p>
-    <w:p>
-      <w:r>
-        <w:br w:type="page"/>
+        <w:t>The home team normally submits by midnight on the following day. The result enters the league-officer approval queue.</w:t>
       </w:r>
     </w:p>
     <w:p>
@@ -1610,538 +1312,112 @@
     <w:p>
       <w:pPr>
         <w:pStyle w:val="ListBullet"/>
-        <w:spacing w:after="80"/>
+        <w:keepNext w:val="0"/>
+        <w:keepLines/>
       </w:pPr>
       <w:r>
-        <w:t>Keep an accurate manual scorecard and continue the match.</w:t>
+        <w:t>Keep the match moving and retain an accurate manual scorecard. Snooker takes priority.</w:t>
       </w:r>
     </w:p>
     <w:p>
       <w:pPr>
         <w:pStyle w:val="ListBullet"/>
-        <w:spacing w:after="80"/>
+        <w:keepNext w:val="0"/>
+        <w:keepLines/>
       </w:pPr>
       <w:r>
-        <w:t>Message the League Secretary and explain what has happened. Please allow time for a reply on match evenings.</w:t>
+        <w:t>Message the League Secretary and allow time for a reply on match evenings.</w:t>
       </w:r>
     </w:p>
     <w:p>
       <w:pPr>
         <w:pStyle w:val="ListBullet"/>
-        <w:spacing w:after="80"/>
+        <w:keepNext w:val="0"/>
+        <w:keepLines/>
       </w:pPr>
       <w:r>
-        <w:t>A result-upload link can be supplied if the normal app process cannot be completed.</w:t>
+        <w:t>A separate result-upload link can be supplied if the normal app journey cannot be completed.</w:t>
       </w:r>
     </w:p>
     <w:p>
       <w:pPr>
         <w:pStyle w:val="ListBullet"/>
-        <w:spacing w:after="80"/>
+        <w:keepNext w:val="0"/>
+        <w:keepLines/>
       </w:pPr>
       <w:r>
-        <w:t>A manually uploaded result needs league-officer authorisation, so it will update more slowly than a normal app submission.</w:t>
+        <w:t>A manual upload requires league-officer authorisation and therefore updates more slowly than a normal app submission.</w:t>
       </w:r>
     </w:p>
     <w:p>
       <w:pPr>
-        <w:pStyle w:val="ListBullet"/>
-        <w:spacing w:after="80"/>
+        <w:pStyle w:val="Heading2"/>
       </w:pPr>
       <w:r>
-        <w:t>WhatsApp is a backup communication route, not the normal result-submission process.</w:t>
-      </w:r>
-    </w:p>
-    <w:p>
-      <w:pPr>
-        <w:pStyle w:val="Heading1"/>
-      </w:pPr>
-      <w:r>
-        <w:t>Correcting mistakes and fixture dates</w:t>
-      </w:r>
-    </w:p>
-    <w:p>
-      <w:pPr>
-        <w:pStyle w:val="ListBullet"/>
-        <w:spacing w:after="80"/>
-      </w:pPr>
-      <w:r>
-        <w:t>Correct an error immediately if the result has not yet been submitted.</w:t>
-      </w:r>
-    </w:p>
-    <w:p>
-      <w:pPr>
-        <w:pStyle w:val="ListBullet"/>
-        <w:spacing w:after="80"/>
-      </w:pPr>
-      <w:r>
-        <w:t>After submission, contact the League Secretary, Chairman or Treasurer. A league officer can deal with the correction during review.</w:t>
-      </w:r>
-    </w:p>
-    <w:p>
-      <w:pPr>
-        <w:pStyle w:val="ListBullet"/>
-        <w:spacing w:after="80"/>
-      </w:pPr>
-      <w:r>
-        <w:t>Use the fixture date request process when a fixture needs to move. Do not rely only on an informal message.</w:t>
-      </w:r>
-    </w:p>
-    <w:p>
-      <w:pPr>
-        <w:pStyle w:val="ListBullet"/>
-        <w:spacing w:after="80"/>
-      </w:pPr>
-      <w:r>
-        <w:t>Report a missing break or player problem promptly so it can be corrected cleanly.</w:t>
-      </w:r>
-    </w:p>
-    <w:p>
-      <w:pPr>
-        <w:pStyle w:val="Heading1"/>
-      </w:pPr>
-      <w:r>
-        <w:t>Captain deadlines</w:t>
+        <w:t>Correcting mistakes</w:t>
       </w:r>
     </w:p>
     <w:tbl>
       <w:tblPr>
         <w:tblW w:type="auto" w:w="0"/>
         <w:jc w:val="center"/>
-        <w:tblLayout w:type="fixed"/>
         <w:tblLook w:firstColumn="1" w:firstRow="1" w:lastColumn="0" w:lastRow="0" w:noHBand="0" w:noVBand="1" w:val="04A0"/>
         <w:tblBorders>
-          <w:top w:val="single" w:sz="4" w:color="D9D9D9"/>
-          <w:left w:val="single" w:sz="4" w:color="D9D9D9"/>
-          <w:bottom w:val="single" w:sz="4" w:color="D9D9D9"/>
-          <w:right w:val="single" w:sz="4" w:color="D9D9D9"/>
-          <w:insideH w:val="single" w:sz="4" w:color="D9D9D9"/>
-          <w:insideV w:val="single" w:sz="4" w:color="D9D9D9"/>
+          <w:top w:val="single" w:sz="6" w:color="D9D9D9"/>
+          <w:left w:val="single" w:sz="6" w:color="D9D9D9"/>
+          <w:bottom w:val="single" w:sz="6" w:color="D9D9D9"/>
+          <w:right w:val="single" w:sz="6" w:color="D9D9D9"/>
+          <w:insideH w:val="single" w:sz="6" w:color="D9D9D9"/>
+          <w:insideV w:val="single" w:sz="6" w:color="D9D9D9"/>
         </w:tblBorders>
       </w:tblPr>
       <w:tblGrid>
-        <w:gridCol w:w="3312"/>
-        <w:gridCol w:w="3312"/>
-        <w:gridCol w:w="3312"/>
+        <w:gridCol w:w="9866"/>
       </w:tblGrid>
-      <w:tr>
-        <w:trPr>
-          <w:tblHeader w:val="true"/>
-        </w:trPr>
-        <w:tc>
-          <w:tcPr>
-            <w:tcW w:type="dxa" w:w="792"/>
-            <w:shd w:fill="17324D"/>
-            <w:vAlign w:val="center"/>
-            <w:tcMar>
-              <w:top w:w="110" w:type="dxa"/>
-              <w:start w:w="140" w:type="dxa"/>
-              <w:bottom w:w="110" w:type="dxa"/>
-              <w:end w:w="140" w:type="dxa"/>
-            </w:tcMar>
-          </w:tcPr>
-          <w:p>
-            <w:r>
-              <w:rPr>
-                <w:rFonts w:ascii="Aptos" w:hAnsi="Aptos"/>
-                <w:b/>
-                <w:color w:val="FFFFFF"/>
-                <w:sz w:val="21"/>
-              </w:rPr>
-              <w:t>Step</w:t>
-            </w:r>
-          </w:p>
-        </w:tc>
-        <w:tc>
-          <w:tcPr>
-            <w:tcW w:type="dxa" w:w="2376"/>
-            <w:shd w:fill="17324D"/>
-            <w:vAlign w:val="center"/>
-            <w:tcMar>
-              <w:top w:w="110" w:type="dxa"/>
-              <w:start w:w="140" w:type="dxa"/>
-              <w:bottom w:w="110" w:type="dxa"/>
-              <w:end w:w="140" w:type="dxa"/>
-            </w:tcMar>
-          </w:tcPr>
-          <w:p>
-            <w:r>
-              <w:rPr>
-                <w:rFonts w:ascii="Aptos" w:hAnsi="Aptos"/>
-                <w:b/>
-                <w:color w:val="FFFFFF"/>
-                <w:sz w:val="21"/>
-              </w:rPr>
-              <w:t>Action</w:t>
-            </w:r>
-          </w:p>
-        </w:tc>
-        <w:tc>
-          <w:tcPr>
-            <w:tcW w:type="dxa" w:w="6696"/>
-            <w:shd w:fill="17324D"/>
-            <w:vAlign w:val="center"/>
-            <w:tcMar>
-              <w:top w:w="110" w:type="dxa"/>
-              <w:start w:w="140" w:type="dxa"/>
-              <w:bottom w:w="110" w:type="dxa"/>
-              <w:end w:w="140" w:type="dxa"/>
-            </w:tcMar>
-          </w:tcPr>
-          <w:p>
-            <w:r>
-              <w:rPr>
-                <w:rFonts w:ascii="Aptos" w:hAnsi="Aptos"/>
-                <w:b/>
-                <w:color w:val="FFFFFF"/>
-                <w:sz w:val="21"/>
-              </w:rPr>
-              <w:t>What to do</w:t>
-            </w:r>
-          </w:p>
-        </w:tc>
-      </w:tr>
       <w:tr>
         <w:tc>
           <w:tcPr>
-            <w:tcW w:type="dxa" w:w="792"/>
-            <w:vAlign w:val="center"/>
-            <w:tcMar>
-              <w:top w:w="110" w:type="dxa"/>
-              <w:start w:w="140" w:type="dxa"/>
-              <w:bottom w:w="110" w:type="dxa"/>
-              <w:end w:w="140" w:type="dxa"/>
-            </w:tcMar>
+            <w:tcW w:type="dxa" w:w="9866"/>
+            <w:shd w:fill="EAF4FA"/>
           </w:tcPr>
           <w:p>
+            <w:r/>
+          </w:p>
+          <w:p>
             <w:pPr>
-              <w:jc w:val="center"/>
+              <w:pStyle w:val="ListBullet"/>
+              <w:spacing w:after="80"/>
             </w:pPr>
             <w:r>
-              <w:rPr>
-                <w:rFonts w:ascii="Aptos" w:hAnsi="Aptos"/>
-                <w:b w:val="0"/>
-                <w:sz w:val="21"/>
-              </w:rPr>
-              <w:t>1</w:t>
+              <w:t>Correct errors before submission whenever possible.</w:t>
             </w:r>
           </w:p>
-        </w:tc>
-        <w:tc>
-          <w:tcPr>
-            <w:tcW w:type="dxa" w:w="2376"/>
-            <w:vAlign w:val="center"/>
-            <w:tcMar>
-              <w:top w:w="110" w:type="dxa"/>
-              <w:start w:w="140" w:type="dxa"/>
-              <w:bottom w:w="110" w:type="dxa"/>
-              <w:end w:w="140" w:type="dxa"/>
-            </w:tcMar>
-          </w:tcPr>
           <w:p>
+            <w:pPr>
+              <w:pStyle w:val="ListBullet"/>
+              <w:spacing w:after="80"/>
+            </w:pPr>
             <w:r>
-              <w:rPr>
-                <w:rFonts w:ascii="Aptos" w:hAnsi="Aptos"/>
-                <w:b/>
-                <w:sz w:val="21"/>
-              </w:rPr>
-              <w:t>Before 19:30</w:t>
+              <w:t>After submission, contact the League Secretary, Chairman or Treasurer so the result can be returned or corrected during review.</w:t>
             </w:r>
           </w:p>
-        </w:tc>
-        <w:tc>
-          <w:tcPr>
-            <w:tcW w:type="dxa" w:w="6696"/>
-            <w:vAlign w:val="center"/>
-            <w:tcMar>
-              <w:top w:w="110" w:type="dxa"/>
-              <w:start w:w="140" w:type="dxa"/>
-              <w:bottom w:w="110" w:type="dxa"/>
-              <w:end w:w="140" w:type="dxa"/>
-            </w:tcMar>
-          </w:tcPr>
-          <w:p>
-            <w:r>
-              <w:rPr>
-                <w:rFonts w:ascii="Aptos" w:hAnsi="Aptos"/>
-                <w:b w:val="0"/>
-                <w:sz w:val="21"/>
-              </w:rPr>
-              <w:t>Complete any required digital lineup activity.</w:t>
-            </w:r>
-          </w:p>
-        </w:tc>
-      </w:tr>
-      <w:tr>
-        <w:tc>
-          <w:tcPr>
-            <w:tcW w:type="dxa" w:w="792"/>
-            <w:shd w:fill="EDF3F8"/>
-            <w:vAlign w:val="center"/>
-            <w:tcMar>
-              <w:top w:w="110" w:type="dxa"/>
-              <w:start w:w="140" w:type="dxa"/>
-              <w:bottom w:w="110" w:type="dxa"/>
-              <w:end w:w="140" w:type="dxa"/>
-            </w:tcMar>
-          </w:tcPr>
           <w:p>
             <w:pPr>
-              <w:jc w:val="center"/>
+              <w:pStyle w:val="ListBullet"/>
+              <w:spacing w:after="80"/>
             </w:pPr>
             <w:r>
-              <w:rPr>
-                <w:rFonts w:ascii="Aptos" w:hAnsi="Aptos"/>
-                <w:b w:val="0"/>
-                <w:sz w:val="21"/>
-              </w:rPr>
-              <w:t>2</w:t>
-            </w:r>
-          </w:p>
-        </w:tc>
-        <w:tc>
-          <w:tcPr>
-            <w:tcW w:type="dxa" w:w="2376"/>
-            <w:shd w:fill="EDF3F8"/>
-            <w:vAlign w:val="center"/>
-            <w:tcMar>
-              <w:top w:w="110" w:type="dxa"/>
-              <w:start w:w="140" w:type="dxa"/>
-              <w:bottom w:w="110" w:type="dxa"/>
-              <w:end w:w="140" w:type="dxa"/>
-            </w:tcMar>
-          </w:tcPr>
-          <w:p>
-            <w:r>
-              <w:rPr>
-                <w:rFonts w:ascii="Aptos" w:hAnsi="Aptos"/>
-                <w:b/>
-                <w:sz w:val="21"/>
-              </w:rPr>
-              <w:t>During the match</w:t>
-            </w:r>
-          </w:p>
-        </w:tc>
-        <w:tc>
-          <w:tcPr>
-            <w:tcW w:type="dxa" w:w="6696"/>
-            <w:shd w:fill="EDF3F8"/>
-            <w:vAlign w:val="center"/>
-            <w:tcMar>
-              <w:top w:w="110" w:type="dxa"/>
-              <w:start w:w="140" w:type="dxa"/>
-              <w:bottom w:w="110" w:type="dxa"/>
-              <w:end w:w="140" w:type="dxa"/>
-            </w:tcMar>
-          </w:tcPr>
-          <w:p>
-            <w:r>
-              <w:rPr>
-                <w:rFonts w:ascii="Aptos" w:hAnsi="Aptos"/>
-                <w:b w:val="0"/>
-                <w:sz w:val="21"/>
-              </w:rPr>
-              <w:t>Record completed frames and qualifying breaks without delaying play.</w:t>
-            </w:r>
-          </w:p>
-        </w:tc>
-      </w:tr>
-      <w:tr>
-        <w:tc>
-          <w:tcPr>
-            <w:tcW w:type="dxa" w:w="792"/>
-            <w:vAlign w:val="center"/>
-            <w:tcMar>
-              <w:top w:w="110" w:type="dxa"/>
-              <w:start w:w="140" w:type="dxa"/>
-              <w:bottom w:w="110" w:type="dxa"/>
-              <w:end w:w="140" w:type="dxa"/>
-            </w:tcMar>
-          </w:tcPr>
-          <w:p>
-            <w:pPr>
-              <w:jc w:val="center"/>
-            </w:pPr>
-            <w:r>
-              <w:rPr>
-                <w:rFonts w:ascii="Aptos" w:hAnsi="Aptos"/>
-                <w:b w:val="0"/>
-                <w:sz w:val="21"/>
-              </w:rPr>
-              <w:t>3</w:t>
-            </w:r>
-          </w:p>
-        </w:tc>
-        <w:tc>
-          <w:tcPr>
-            <w:tcW w:type="dxa" w:w="2376"/>
-            <w:vAlign w:val="center"/>
-            <w:tcMar>
-              <w:top w:w="110" w:type="dxa"/>
-              <w:start w:w="140" w:type="dxa"/>
-              <w:bottom w:w="110" w:type="dxa"/>
-              <w:end w:w="140" w:type="dxa"/>
-            </w:tcMar>
-          </w:tcPr>
-          <w:p>
-            <w:r>
-              <w:rPr>
-                <w:rFonts w:ascii="Aptos" w:hAnsi="Aptos"/>
-                <w:b/>
-                <w:sz w:val="21"/>
-              </w:rPr>
-              <w:t>After the final frame</w:t>
-            </w:r>
-          </w:p>
-        </w:tc>
-        <w:tc>
-          <w:tcPr>
-            <w:tcW w:type="dxa" w:w="6696"/>
-            <w:vAlign w:val="center"/>
-            <w:tcMar>
-              <w:top w:w="110" w:type="dxa"/>
-              <w:start w:w="140" w:type="dxa"/>
-              <w:bottom w:w="110" w:type="dxa"/>
-              <w:end w:w="140" w:type="dxa"/>
-            </w:tcMar>
-          </w:tcPr>
-          <w:p>
-            <w:r>
-              <w:rPr>
-                <w:rFonts w:ascii="Aptos" w:hAnsi="Aptos"/>
-                <w:b w:val="0"/>
-                <w:sz w:val="21"/>
-              </w:rPr>
-              <w:t>Review the full card with both teams before submission.</w:t>
-            </w:r>
-          </w:p>
-        </w:tc>
-      </w:tr>
-      <w:tr>
-        <w:tc>
-          <w:tcPr>
-            <w:tcW w:type="dxa" w:w="792"/>
-            <w:shd w:fill="EDF3F8"/>
-            <w:vAlign w:val="center"/>
-            <w:tcMar>
-              <w:top w:w="110" w:type="dxa"/>
-              <w:start w:w="140" w:type="dxa"/>
-              <w:bottom w:w="110" w:type="dxa"/>
-              <w:end w:w="140" w:type="dxa"/>
-            </w:tcMar>
-          </w:tcPr>
-          <w:p>
-            <w:pPr>
-              <w:jc w:val="center"/>
-            </w:pPr>
-            <w:r>
-              <w:rPr>
-                <w:rFonts w:ascii="Aptos" w:hAnsi="Aptos"/>
-                <w:b w:val="0"/>
-                <w:sz w:val="21"/>
-              </w:rPr>
-              <w:t>4</w:t>
-            </w:r>
-          </w:p>
-        </w:tc>
-        <w:tc>
-          <w:tcPr>
-            <w:tcW w:type="dxa" w:w="2376"/>
-            <w:shd w:fill="EDF3F8"/>
-            <w:vAlign w:val="center"/>
-            <w:tcMar>
-              <w:top w:w="110" w:type="dxa"/>
-              <w:start w:w="140" w:type="dxa"/>
-              <w:bottom w:w="110" w:type="dxa"/>
-              <w:end w:w="140" w:type="dxa"/>
-            </w:tcMar>
-          </w:tcPr>
-          <w:p>
-            <w:r>
-              <w:rPr>
-                <w:rFonts w:ascii="Aptos" w:hAnsi="Aptos"/>
-                <w:b/>
-                <w:sz w:val="21"/>
-              </w:rPr>
-              <w:t>By midnight next day</w:t>
-            </w:r>
-          </w:p>
-        </w:tc>
-        <w:tc>
-          <w:tcPr>
-            <w:tcW w:type="dxa" w:w="6696"/>
-            <w:shd w:fill="EDF3F8"/>
-            <w:vAlign w:val="center"/>
-            <w:tcMar>
-              <w:top w:w="110" w:type="dxa"/>
-              <w:start w:w="140" w:type="dxa"/>
-              <w:bottom w:w="110" w:type="dxa"/>
-              <w:end w:w="140" w:type="dxa"/>
-            </w:tcMar>
-          </w:tcPr>
-          <w:p>
-            <w:r>
-              <w:rPr>
-                <w:rFonts w:ascii="Aptos" w:hAnsi="Aptos"/>
-                <w:b w:val="0"/>
-                <w:sz w:val="21"/>
-              </w:rPr>
-              <w:t>Submit the completed result.</w:t>
+              <w:t>Use the fixture-date request process when a match needs to move. Do not rely only on an informal message.</w:t>
             </w:r>
           </w:p>
         </w:tc>
       </w:tr>
     </w:tbl>
-    <w:p>
-      <w:r>
-        <w:br w:type="page"/>
-      </w:r>
-    </w:p>
-    <w:p>
-      <w:pPr>
-        <w:pStyle w:val="Heading1"/>
-      </w:pPr>
-      <w:r>
-        <w:t>When you need help</w:t>
-      </w:r>
-    </w:p>
-    <w:p>
-      <w:pPr>
-        <w:pStyle w:val="ListBullet"/>
-      </w:pPr>
-      <w:r>
-        <w:t>Use password reset if you cannot sign in. Do not create another account.</w:t>
-      </w:r>
-    </w:p>
-    <w:p>
-      <w:pPr>
-        <w:pStyle w:val="ListBullet"/>
-      </w:pPr>
-      <w:r>
-        <w:t>If your account is linked to the wrong player, use the claim or player update process.</w:t>
-      </w:r>
-    </w:p>
-    <w:p>
-      <w:pPr>
-        <w:pStyle w:val="ListBullet"/>
-      </w:pPr>
-      <w:r>
-        <w:t>If a result, player or break is wrong, contact your captain or a league officer promptly. Do not submit a duplicate result.</w:t>
-      </w:r>
-    </w:p>
-    <w:p>
-      <w:pPr>
-        <w:pStyle w:val="ListBullet"/>
-      </w:pPr>
-      <w:r>
-        <w:t>If the app causes a problem on match night, keep the match moving, retain an accurate paper scorecard and message the League Secretary. Please allow time for a reply. The app should support the match, not delay it. Snooker takes priority.</w:t>
-      </w:r>
-    </w:p>
     <w:sectPr>
       <w:headerReference w:type="default" r:id="rId9"/>
       <w:footerReference w:type="default" r:id="rId10"/>
-      <w:pgSz w:w="12240" w:h="15840"/>
-      <w:pgMar w:top="1008" w:right="1152" w:bottom="936" w:left="1152" w:header="720" w:footer="720" w:gutter="0"/>
+      <w:pgSz w:w="11906" w:h="16838"/>
+      <w:pgMar w:top="964" w:right="1020" w:bottom="964" w:left="1020" w:header="720" w:footer="720" w:gutter="0"/>
       <w:cols w:space="720"/>
       <w:docGrid w:linePitch="360"/>
     </w:sectPr>
@@ -2154,17 +1430,16 @@
   <w:p>
     <w:pPr>
       <w:pStyle w:val="Footer"/>
-      <w:jc w:val="right"/>
+      <w:jc w:val="center"/>
     </w:pPr>
     <w:r>
       <w:rPr>
-        <w:rFonts w:ascii="Aptos" w:hAnsi="Aptos"/>
-        <w:color w:val="5F6B76"/>
-        <w:sz w:val="18"/>
-      </w:rPr>
-      <w:t xml:space="preserve">Page </w:t>
+        <w:rFonts w:ascii="Arial" w:hAnsi="Arial"/>
+        <w:color w:val="64748B"/>
+        <w:sz w:val="16"/>
+      </w:rPr>
+      <w:t>Captain and Vice Captain Guide  |  2026 and 2027 season</w:t>
     </w:r>
-    <w:fldSimple w:instr="PAGE"/>
   </w:p>
 </w:ftr>
 </file>
@@ -2178,10 +1453,10 @@
     </w:pPr>
     <w:r>
       <w:rPr>
-        <w:rFonts w:ascii="Aptos" w:hAnsi="Aptos"/>
-        <w:b/>
-        <w:color w:val="000000"/>
-        <w:sz w:val="17"/>
+        <w:rFonts w:ascii="Arial" w:hAnsi="Arial"/>
+        <w:b/>
+        <w:color w:val="0F766E"/>
+        <w:sz w:val="16"/>
       </w:rPr>
       <w:t>RACK AND FRAME LEAGUE MANAGER</w:t>
     </w:r>
@@ -2553,12 +1828,12 @@
     <w:qFormat/>
     <w:rsid w:val="00FC693F"/>
     <w:pPr>
-      <w:spacing w:after="120" w:line="269" w:lineRule="auto"/>
+      <w:spacing w:after="120" w:line="259" w:lineRule="auto"/>
     </w:pPr>
     <w:rPr>
-      <w:rFonts w:ascii="Aptos" w:hAnsi="Aptos"/>
-      <w:color w:val="26333F"/>
-      <w:sz w:val="22"/>
+      <w:rFonts w:ascii="Arial" w:hAnsi="Arial"/>
+      <w:color w:val="000000"/>
+      <w:sz w:val="21"/>
     </w:rPr>
   </w:style>
   <w:style w:type="paragraph" w:styleId="Header">
@@ -2616,15 +1891,15 @@
     <w:pPr>
       <w:keepNext/>
       <w:keepLines/>
-      <w:spacing w:before="280" w:after="140"/>
+      <w:spacing w:before="160" w:after="140"/>
       <w:outlineLvl w:val="0"/>
     </w:pPr>
     <w:rPr>
-      <w:rFonts w:asciiTheme="majorHAnsi" w:eastAsiaTheme="majorEastAsia" w:hAnsiTheme="majorHAnsi" w:cstheme="majorBidi" w:ascii="Aptos Display" w:hAnsi="Aptos Display"/>
+      <w:rFonts w:asciiTheme="majorHAnsi" w:eastAsiaTheme="majorEastAsia" w:hAnsiTheme="majorHAnsi" w:cstheme="majorBidi" w:ascii="Arial" w:hAnsi="Arial"/>
       <w:b/>
       <w:bCs/>
       <w:color w:val="000000"/>
-      <w:sz w:val="36"/>
+      <w:sz w:val="40"/>
       <w:szCs w:val="28"/>
     </w:rPr>
   </w:style>
@@ -2640,15 +1915,15 @@
     <w:pPr>
       <w:keepNext/>
       <w:keepLines/>
-      <w:spacing w:before="200" w:after="100"/>
+      <w:spacing w:before="160" w:after="140"/>
       <w:outlineLvl w:val="1"/>
     </w:pPr>
     <w:rPr>
-      <w:rFonts w:asciiTheme="majorHAnsi" w:eastAsiaTheme="majorEastAsia" w:hAnsiTheme="majorHAnsi" w:cstheme="majorBidi" w:ascii="Aptos" w:hAnsi="Aptos"/>
+      <w:rFonts w:asciiTheme="majorHAnsi" w:eastAsiaTheme="majorEastAsia" w:hAnsiTheme="majorHAnsi" w:cstheme="majorBidi" w:ascii="Arial" w:hAnsi="Arial"/>
       <w:b/>
       <w:bCs/>
       <w:color w:val="000000"/>
-      <w:sz w:val="26"/>
+      <w:sz w:val="28"/>
       <w:szCs w:val="26"/>
     </w:rPr>
   </w:style>
@@ -2902,17 +2177,19 @@
     <w:qFormat/>
     <w:rsid w:val="00FC693F"/>
     <w:pPr>
-      <w:keepNext/>
-      <w:spacing w:after="200" w:line="240" w:lineRule="auto" w:before="0"/>
+      <w:pBdr>
+        <w:bottom w:val="single" w:sz="8" w:space="4" w:color="4F81BD" w:themeColor="accent1"/>
+      </w:pBdr>
+      <w:spacing w:after="300" w:line="240" w:lineRule="auto"/>
       <w:contextualSpacing/>
     </w:pPr>
     <w:rPr>
-      <w:rFonts w:asciiTheme="majorHAnsi" w:eastAsiaTheme="majorEastAsia" w:hAnsiTheme="majorHAnsi" w:cstheme="majorBidi" w:ascii="Aptos Display" w:hAnsi="Aptos Display"/>
+      <w:rFonts w:asciiTheme="majorHAnsi" w:eastAsiaTheme="majorEastAsia" w:hAnsiTheme="majorHAnsi" w:cstheme="majorBidi" w:ascii="Arial" w:hAnsi="Arial"/>
       <w:b/>
       <w:color w:val="000000"/>
       <w:spacing w:val="5"/>
       <w:kern w:val="28"/>
-      <w:sz w:val="54"/>
+      <w:sz w:val="60"/>
       <w:szCs w:val="52"/>
     </w:rPr>
   </w:style>
@@ -3350,9 +2627,11 @@
       <w:spacing w:line="240" w:lineRule="auto"/>
     </w:pPr>
     <w:rPr>
+      <w:rFonts w:ascii="Arial" w:hAnsi="Arial"/>
       <w:b/>
       <w:bCs/>
-      <w:color w:val="4F81BD" w:themeColor="accent1"/>
+      <w:i/>
+      <w:color w:val="475569"/>
       <w:sz w:val="18"/>
       <w:szCs w:val="18"/>
     </w:rPr>

</xml_diff>